<commit_message>
begin surge tower revisions
</commit_message>
<xml_diff>
--- a/exercises/HP-3-surge-tower/tutorial-sheet.docx
+++ b/exercises/HP-3-surge-tower/tutorial-sheet.docx
@@ -24,7 +24,7 @@
           <w:b w:val="0"/>
           <w:i/>
         </w:rPr>
-        <w:t>Complete by hand before the hydraulician session (exercise HP-3, Design the surge tower). Bring your answers: the session starts from them, and Part D is what you will measure on screen.</w:t>
+        <w:t>Complete by hand before the hydraulician session (exercise HP-3, Design the surge tower). Everything on this sheet is the scheme you will run, and every number can be checked on screen.</w:t>
       </w:r>
     </w:p>
     <w:p>
@@ -42,7 +42,7 @@
       <w:r>
         <w:drawing>
           <wp:inline xmlns:a="http://schemas.openxmlformats.org/drawingml/2006/main" xmlns:pic="http://schemas.openxmlformats.org/drawingml/2006/picture">
-            <wp:extent cx="5220000" cy="2670698"/>
+            <wp:extent cx="5400000" cy="2908374"/>
             <wp:docPr id="1" name="Picture 1"/>
             <wp:cNvGraphicFramePr>
               <a:graphicFrameLocks noChangeAspect="1"/>
@@ -51,7 +51,7 @@
               <a:graphicData uri="http://schemas.openxmlformats.org/drawingml/2006/picture">
                 <pic:pic>
                   <pic:nvPicPr>
-                    <pic:cNvPr id="0" name="scheme.png"/>
+                    <pic:cNvPr id="0" name="scheme-model.png"/>
                     <pic:cNvPicPr/>
                   </pic:nvPicPr>
                   <pic:blipFill>
@@ -63,7 +63,7 @@
                   <pic:spPr>
                     <a:xfrm>
                       <a:off x="0" y="0"/>
-                      <a:ext cx="5220000" cy="2670698"/>
+                      <a:ext cx="5400000" cy="2908374"/>
                     </a:xfrm>
                     <a:prstGeom prst="rect"/>
                   </pic:spPr>
@@ -83,7 +83,7 @@
           <w:b w:val="0"/>
           <w:i w:val="0"/>
         </w:rPr>
-        <w:t>A high-head scheme in the Alps, simplified to a single line of pipe (figure). The headrace tunnel runs level from the reservoir to a surge tower and a penstock drops from there to the power house.</w:t>
+        <w:t>The scheme is the one the app holds for exercise HP-3 (figure, in true proportion, drawn with a 3 m shaft). The model is a vertical slice one metre wide, so discharges are per metre of width and the areas in the formulas are heights: A/A_s = D_h/D_s. The datum is the domain floor. A level headrace runs from the reservoir to a knee, where an open surge shaft rises off it; from the knee a penstock drops to a level tailpipe and a nozzle that discharges to the air.</w:t>
       </w:r>
     </w:p>
     <w:tbl>
@@ -100,7 +100,7 @@
       <w:tr>
         <w:tc>
           <w:tcPr>
-            <w:tcW w:type="dxa" w:w="2268"/>
+            <w:tcW w:type="dxa" w:w="1814"/>
           </w:tcPr>
           <w:p>
             <w:r/>
@@ -115,7 +115,7 @@
         </w:tc>
         <w:tc>
           <w:tcPr>
-            <w:tcW w:type="dxa" w:w="6803"/>
+            <w:tcW w:type="dxa" w:w="7597"/>
           </w:tcPr>
           <w:p>
             <w:r/>
@@ -132,7 +132,7 @@
       <w:tr>
         <w:tc>
           <w:tcPr>
-            <w:tcW w:type="dxa" w:w="2268"/>
+            <w:tcW w:type="dxa" w:w="1814"/>
           </w:tcPr>
           <w:p>
             <w:r/>
@@ -140,13 +140,13 @@
               <w:rPr>
                 <w:sz w:val="20"/>
               </w:rPr>
-              <w:t>reservoir level</w:t>
+              <w:t>reservoir</w:t>
             </w:r>
           </w:p>
         </w:tc>
         <w:tc>
           <w:tcPr>
-            <w:tcW w:type="dxa" w:w="6803"/>
+            <w:tcW w:type="dxa" w:w="7597"/>
           </w:tcPr>
           <w:p>
             <w:r/>
@@ -154,7 +154,7 @@
               <w:rPr>
                 <w:sz w:val="20"/>
               </w:rPr>
-              <w:t>1705 m (Barrage de Grand'Maison)</w:t>
+              <w:t>level 24.9 m above datum (the slider says 25.0; a gauge by the wall reads 24.9)</w:t>
             </w:r>
           </w:p>
         </w:tc>
@@ -162,7 +162,7 @@
       <w:tr>
         <w:tc>
           <w:tcPr>
-            <w:tcW w:type="dxa" w:w="2268"/>
+            <w:tcW w:type="dxa" w:w="1814"/>
           </w:tcPr>
           <w:p>
             <w:r/>
@@ -170,13 +170,13 @@
               <w:rPr>
                 <w:sz w:val="20"/>
               </w:rPr>
-              <w:t>headrace tunnel</w:t>
+              <w:t>headrace</w:t>
             </w:r>
           </w:p>
         </w:tc>
         <w:tc>
           <w:tcPr>
-            <w:tcW w:type="dxa" w:w="6803"/>
+            <w:tcW w:type="dxa" w:w="7597"/>
           </w:tcPr>
           <w:p>
             <w:r/>
@@ -184,7 +184,7 @@
               <w:rPr>
                 <w:sz w:val="20"/>
               </w:rPr>
-              <w:t>7.7 km long, 7.7 m diameter, level</w:t>
+              <w:t>level; invert at 12.5 m; bore D_h = 3.05 m; length L = 42.4 m from the reservoir wall (x = 7.65 m) to the centre of the surge shaft (x = 50 m)</w:t>
             </w:r>
           </w:p>
         </w:tc>
@@ -192,7 +192,7 @@
       <w:tr>
         <w:tc>
           <w:tcPr>
-            <w:tcW w:type="dxa" w:w="2268"/>
+            <w:tcW w:type="dxa" w:w="1814"/>
           </w:tcPr>
           <w:p>
             <w:r/>
@@ -200,13 +200,13 @@
               <w:rPr>
                 <w:sz w:val="20"/>
               </w:rPr>
-              <w:t>surge tower</w:t>
+              <w:t>surge shaft</w:t>
             </w:r>
           </w:p>
         </w:tc>
         <w:tc>
           <w:tcPr>
-            <w:tcW w:type="dxa" w:w="6803"/>
+            <w:tcW w:type="dxa" w:w="7597"/>
           </w:tcPr>
           <w:p>
             <w:r/>
@@ -214,7 +214,7 @@
               <w:rPr>
                 <w:sz w:val="20"/>
               </w:rPr>
-              <w:t>15 m diameter, at the downstream end of the headrace</w:t>
+              <w:t>width D_s = 2.5 + 0.5·d metres, d the last digit of your student number; open to the air; rises off the headrace at the knee, x = 50 m. The domain roof is at 35 m.</w:t>
             </w:r>
           </w:p>
         </w:tc>
@@ -222,7 +222,7 @@
       <w:tr>
         <w:tc>
           <w:tcPr>
-            <w:tcW w:type="dxa" w:w="2268"/>
+            <w:tcW w:type="dxa" w:w="1814"/>
           </w:tcPr>
           <w:p>
             <w:r/>
@@ -236,7 +236,7 @@
         </w:tc>
         <w:tc>
           <w:tcPr>
-            <w:tcW w:type="dxa" w:w="6803"/>
+            <w:tcW w:type="dxa" w:w="7597"/>
           </w:tcPr>
           <w:p>
             <w:r/>
@@ -244,7 +244,7 @@
               <w:rPr>
                 <w:sz w:val="20"/>
               </w:rPr>
-              <w:t>1.7 km long, 3 m diameter, down to the power house at 772 m</w:t>
+              <w:t>bore D_p = 2.4 m; 14.9 m from the knee at (x, z) = (50, 14) down to (60, 3), then a 5 m level tailpipe to the nozzle at x = 65 m: L_p ≈ 20 m in all</w:t>
             </w:r>
           </w:p>
         </w:tc>
@@ -252,7 +252,7 @@
       <w:tr>
         <w:tc>
           <w:tcPr>
-            <w:tcW w:type="dxa" w:w="2268"/>
+            <w:tcW w:type="dxa" w:w="1814"/>
           </w:tcPr>
           <w:p>
             <w:r/>
@@ -260,13 +260,13 @@
               <w:rPr>
                 <w:sz w:val="20"/>
               </w:rPr>
-              <w:t>design flow</w:t>
+              <w:t>nozzle</w:t>
             </w:r>
           </w:p>
         </w:tc>
         <w:tc>
           <w:tcPr>
-            <w:tcW w:type="dxa" w:w="6803"/>
+            <w:tcW w:type="dxa" w:w="7597"/>
           </w:tcPr>
           <w:p>
             <w:r/>
@@ -274,7 +274,7 @@
               <w:rPr>
                 <w:sz w:val="20"/>
               </w:rPr>
-              <w:t>217 m³/s</w:t>
+              <w:t>opening 0.48 m centred on the tailpipe axis at z = 3.0 m, discharging to atmosphere. The valve at x = 63.5 m, just upstream of it, is the turbine's instantaneous shutdown (the V key).</w:t>
             </w:r>
           </w:p>
         </w:tc>
@@ -282,7 +282,7 @@
       <w:tr>
         <w:tc>
           <w:tcPr>
-            <w:tcW w:type="dxa" w:w="2268"/>
+            <w:tcW w:type="dxa" w:w="1814"/>
           </w:tcPr>
           <w:p>
             <w:r/>
@@ -290,13 +290,13 @@
               <w:rPr>
                 <w:sz w:val="20"/>
               </w:rPr>
-              <w:t>friction factor</w:t>
+              <w:t>steady discharge</w:t>
             </w:r>
           </w:p>
         </w:tc>
         <w:tc>
           <w:tcPr>
-            <w:tcW w:type="dxa" w:w="6803"/>
+            <w:tcW w:type="dxa" w:w="7597"/>
           </w:tcPr>
           <w:p>
             <w:r/>
@@ -304,7 +304,7 @@
               <w:rPr>
                 <w:sz w:val="20"/>
               </w:rPr>
-              <w:t>0.006 (Fanning, the value the worked example used); in Darcy form λ = 4f = 0.024 — this sheet works in Darcy form throughout</w:t>
+              <w:t>q₀ = 7.6 m²/s per metre of width (hover the headrace on screen: the card prints q and the bore-mean V)</w:t>
             </w:r>
           </w:p>
         </w:tc>
@@ -312,7 +312,37 @@
       <w:tr>
         <w:tc>
           <w:tcPr>
-            <w:tcW w:type="dxa" w:w="2268"/>
+            <w:tcW w:type="dxa" w:w="1814"/>
+          </w:tcPr>
+          <w:p>
+            <w:r/>
+            <w:r>
+              <w:rPr>
+                <w:sz w:val="20"/>
+              </w:rPr>
+              <w:t>friction</w:t>
+            </w:r>
+          </w:p>
+        </w:tc>
+        <w:tc>
+          <w:tcPr>
+            <w:tcW w:type="dxa" w:w="7597"/>
+          </w:tcPr>
+          <w:p>
+            <w:r/>
+            <w:r>
+              <w:rPr>
+                <w:sz w:val="20"/>
+              </w:rPr>
+              <w:t>Darcy f = 0.03, measured in the app with two gauges 22 m apart on the headrace axis (the optional part of the exercise repeats that measurement). For a slot one metre wide the hydraulic diameter is D_H = 2D (R_h = D/2), so h_f = f·(L/D_H)·u²/(2g).</w:t>
+            </w:r>
+          </w:p>
+        </w:tc>
+      </w:tr>
+      <w:tr>
+        <w:tc>
+          <w:tcPr>
+            <w:tcW w:type="dxa" w:w="1814"/>
           </w:tcPr>
           <w:p>
             <w:r/>
@@ -326,7 +356,7 @@
         </w:tc>
         <w:tc>
           <w:tcPr>
-            <w:tcW w:type="dxa" w:w="6803"/>
+            <w:tcW w:type="dxa" w:w="7597"/>
           </w:tcPr>
           <w:p>
             <w:r/>
@@ -347,30 +377,6 @@
     </w:p>
     <w:p>
       <w:pPr>
-        <w:spacing w:after="40"/>
-      </w:pPr>
-      <w:r>
-        <w:rPr>
-          <w:b/>
-          <w:i w:val="0"/>
-        </w:rPr>
-        <w:t>The question, as set:</w:t>
-      </w:r>
-    </w:p>
-    <w:p>
-      <w:pPr>
-        <w:spacing w:after="160"/>
-      </w:pPr>
-      <w:r>
-        <w:rPr>
-          <w:b w:val="0"/>
-          <w:i/>
-        </w:rPr>
-        <w:t>“Assuming a constant friction factor of 0.006 estimate the height of the surge tower required to accommodate instantaneous shut-down of the power plant, where the surge tower is 15 m in diameter.”</w:t>
-      </w:r>
-    </w:p>
-    <w:p>
-      <w:pPr>
         <w:pStyle w:val="Heading2"/>
       </w:pPr>
       <w:r>
@@ -386,7 +392,7 @@
           <w:b w:val="0"/>
           <w:i w:val="0"/>
         </w:rPr>
-        <w:t>z is the water level in the tower measured DOWN from the reservoir level (positive below it), so the steady running level is z₀ and the highest point of the upsurge is z_max above the reservoir. u is the headrace velocity, L its length, A its area, A_s the tower area, k the loss coefficient in h_f = k·u², Z the length scale L·A/(2·g·k·A_s). This is the app's notation (docs/notation.md); the worked example you have seen writes y for z.</w:t>
+        <w:t>z is the shaft water level measured DOWN from the reservoir level (positive below it); z₀ is the steady level and z_max the crest above the reservoir. u is the headrace velocity, L and A the headrace length and area (A = D_h), A_s the shaft area (A_s = D_s), k the lumped loss coefficient in z₀ = k·u₀², and Z = L·A/(2·g·k·A_s). This is the app's notation (docs/notation.md); the worked example the class has seen writes y for z.</w:t>
       </w:r>
     </w:p>
     <w:p>
@@ -394,22 +400,26 @@
         <w:pStyle w:val="Heading1"/>
       </w:pPr>
       <w:r>
-        <w:t>Part A — Steady running</w:t>
+        <w:t>Part A — Steady running (predict, then read on screen)</w:t>
       </w:r>
     </w:p>
     <w:p>
       <w:pPr>
-        <w:pStyle w:val="ListNumber"/>
+        <w:tabs>
+          <w:tab w:pos="567" w:val="left"/>
+        </w:tabs>
         <w:spacing w:after="80"/>
+        <w:ind w:left="567" w:hanging="567"/>
       </w:pPr>
       <w:r>
         <w:rPr>
           <w:b/>
         </w:rPr>
         <w:t>A1.</w:t>
+        <w:tab/>
       </w:r>
       <w:r>
-        <w:t xml:space="preserve"> Find the velocity in the headrace tunnel at the design flow.</w:t>
+        <w:t>Find the headrace velocity, u₀ = q₀/D_h.</w:t>
       </w:r>
     </w:p>
     <w:p>
@@ -435,17 +445,21 @@
     </w:p>
     <w:p>
       <w:pPr>
-        <w:pStyle w:val="ListNumber"/>
+        <w:tabs>
+          <w:tab w:pos="567" w:val="left"/>
+        </w:tabs>
         <w:spacing w:after="80"/>
+        <w:ind w:left="567" w:hanging="567"/>
       </w:pPr>
       <w:r>
         <w:rPr>
           <w:b/>
         </w:rPr>
         <w:t>A2.</w:t>
+        <w:tab/>
       </w:r>
       <w:r>
-        <w:t xml:space="preserve"> Find the friction head loss along the headrace (Darcy–Weisbach, λ = 0.024). How far below the reservoir level does the water in the surge tower stand in steady running, and why is the tower a piezometer?</w:t>
+        <w:t>Find the friction loss along the headrace, with D_H = 2·D_h.</w:t>
       </w:r>
     </w:p>
     <w:p>
@@ -458,7 +472,47 @@
           <w:rFonts w:ascii="Cambria Math" w:hAnsi="Cambria Math" w:eastAsia="Cambria Math"/>
           <w:sz w:val="23"/>
         </w:rPr>
-        <w:t>h_f = λ · (L/D) · u₀² / (2g)</w:t>
+        <w:t>h_f = f · (L/D_H) · u₀² / (2g)</w:t>
+      </w:r>
+    </w:p>
+    <w:p>
+      <w:pPr>
+        <w:spacing w:after="0"/>
+        <w:pBdr>
+          <w:bottom w:val="dotted" w:sz="4" w:space="1" w:color="A0A0A0"/>
+        </w:pBdr>
+      </w:pPr>
+    </w:p>
+    <w:p>
+      <w:pPr>
+        <w:spacing w:after="0"/>
+        <w:pBdr>
+          <w:bottom w:val="dotted" w:sz="4" w:space="1" w:color="A0A0A0"/>
+        </w:pBdr>
+      </w:pPr>
+    </w:p>
+    <w:p>
+      <w:pPr>
+        <w:spacing w:after="40"/>
+      </w:pPr>
+    </w:p>
+    <w:p>
+      <w:pPr>
+        <w:tabs>
+          <w:tab w:pos="567" w:val="left"/>
+        </w:tabs>
+        <w:spacing w:after="80"/>
+        <w:ind w:left="567" w:hanging="567"/>
+      </w:pPr>
+      <w:r>
+        <w:rPr>
+          <w:b/>
+        </w:rPr>
+        <w:t>A3.</w:t>
+        <w:tab/>
+      </w:r>
+      <w:r>
+        <w:t>The shaft is open to the air and carries no flow: it is a piezometer at the knee and reads the hydraulic grade line there. How far below the reservoir does its water stand? Take the entry loss as negligible, so the drawdown is the velocity head u₀²/2g plus h_f. The app's gauges read about 0.35 m; explain why your prediction lies within the wobble of that reading.</w:t>
       </w:r>
     </w:p>
     <w:p>
@@ -492,17 +546,21 @@
     </w:p>
     <w:p>
       <w:pPr>
-        <w:pStyle w:val="ListNumber"/>
+        <w:tabs>
+          <w:tab w:pos="567" w:val="left"/>
+        </w:tabs>
         <w:spacing w:after="80"/>
+        <w:ind w:left="567" w:hanging="567"/>
       </w:pPr>
       <w:r>
         <w:rPr>
           <w:b/>
         </w:rPr>
-        <w:t>A3.</w:t>
+        <w:t>A4.</w:t>
+        <w:tab/>
       </w:r>
       <w:r>
-        <w:t xml:space="preserve"> Write the loss as h_f = k·u₀² and find k (s²/m). Keep it: the surge calculation uses k, not λ.</w:t>
+        <w:t>Write the whole drawdown as z₀ = k·u₀² and find k (s²/m). Keep it: the surge calculation uses k, not f.</w:t>
       </w:r>
     </w:p>
     <w:p>
@@ -543,7 +601,7 @@
           <w:b w:val="0"/>
           <w:i w:val="0"/>
         </w:rPr>
-        <w:t>Rigid column: the water in the headrace is one incompressible slug of length L; when the turbines shut, it decelerates against the head it builds up in the tower. With the level z measured down from the reservoir:</w:t>
+        <w:t>Rigid column: the water in the headrace is one incompressible slug of length L. When the valve slams, the slug decelerates against the head it builds up in the shaft. With the level z measured down from the reservoir:</w:t>
       </w:r>
     </w:p>
     <w:p>
@@ -561,17 +619,21 @@
     </w:p>
     <w:p>
       <w:pPr>
-        <w:pStyle w:val="ListNumber"/>
+        <w:tabs>
+          <w:tab w:pos="567" w:val="left"/>
+        </w:tabs>
         <w:spacing w:after="80"/>
+        <w:ind w:left="567" w:hanging="567"/>
       </w:pPr>
       <w:r>
         <w:rPr>
           <w:b/>
         </w:rPr>
         <w:t>B1.</w:t>
+        <w:tab/>
       </w:r>
       <w:r>
-        <w:t xml:space="preserve"> Ignore friction. Eliminate t between the two equations (or write the energy balance) and show that the column comes to rest when the tower has risen z_max = u₀·√(L·A/(g·A_s)) above the reservoir, and that the oscillation has period T = 2π·√(L·A_s/(g·A)). Evaluate both for the scheme.</w:t>
+        <w:t>Ignore friction. Eliminate t between the two equations (or write the energy balance) and show that the column comes to rest when the shaft has risen z_max = u₀·√(L·A/(g·A_s)) above the reservoir, and that the oscillation has period T = 2π·√(L·A_s/(g·A)). Evaluate both for your D_s.</w:t>
       </w:r>
     </w:p>
     <w:p>
@@ -621,17 +683,21 @@
     </w:p>
     <w:p>
       <w:pPr>
-        <w:pStyle w:val="ListNumber"/>
+        <w:tabs>
+          <w:tab w:pos="567" w:val="left"/>
+        </w:tabs>
         <w:spacing w:after="80"/>
+        <w:ind w:left="567" w:hanging="567"/>
       </w:pPr>
       <w:r>
         <w:rPr>
           <w:b/>
         </w:rPr>
         <w:t>B2.</w:t>
+        <w:tab/>
       </w:r>
       <w:r>
-        <w:t xml:space="preserve"> Now keep friction. Dividing the two equations gives a linear equation in u² whose solution is</w:t>
+        <w:t>Now keep friction. Dividing the two equations gives a linear equation in u² whose solution is</w:t>
       </w:r>
     </w:p>
     <w:p>
@@ -656,7 +722,7 @@
           <w:b w:val="0"/>
           <w:i w:val="0"/>
         </w:rPr>
-        <w:t>C is fixed by the steady state (u = u₀ at z = z₀ = k·u₀²): C = −(Z/k)·e^(−z₀/Z). The upsurge crest is where u = 0. Evaluate Z and C, then find the crest by trial and error on</w:t>
+        <w:t>C is fixed by the steady state (u = u₀ at z = z₀ = k·u₀²): C = −(Z/k)·e^(−z₀/Z). The crest is where u = 0. Evaluate Z and C for your D_s, then find the crest by trial on</w:t>
       </w:r>
     </w:p>
     <w:p>
@@ -681,7 +747,7 @@
           <w:b w:val="0"/>
           <w:i w:val="0"/>
         </w:rPr>
-        <w:t>(z is negative above the reservoir; start the trials near −z_max from B1 and work upward). Tabulate three or four trials.</w:t>
+        <w:t>(z is negative above the reservoir; start the trials near −z_max from B1 and work upward). Tabulate three or four trials. z₀/Z is small here, so the crest lands within about 0.13 m of z_max − z₀, a little above it; do the trial anyway and see.</w:t>
       </w:r>
     </w:p>
     <w:tbl>
@@ -1004,17 +1070,21 @@
     </w:p>
     <w:p>
       <w:pPr>
-        <w:pStyle w:val="ListNumber"/>
+        <w:tabs>
+          <w:tab w:pos="567" w:val="left"/>
+        </w:tabs>
         <w:spacing w:after="80"/>
+        <w:ind w:left="567" w:hanging="567"/>
       </w:pPr>
       <w:r>
         <w:rPr>
           <w:b/>
         </w:rPr>
         <w:t>B3.</w:t>
+        <w:tab/>
       </w:r>
       <w:r>
-        <w:t xml:space="preserve"> How much of the frictionless upsurge did friction remove? Hence the height of tower required above the reservoir level, and — with a freeboard of your choosing and the tower base at the level the figure gives — the height to adopt.</w:t>
+        <w:t>The crest's elevation above datum is 24.9 + z_max. Does your shaft hold the first upsurge with 3 m of freeboard under the 35 m roof? What is the narrowest shaft, to 0.1 m, that would? (Use the with-friction crest ≈ u₀·√(L·D_h/(g·D_s)) − z₀.)</w:t>
       </w:r>
     </w:p>
     <w:p>
@@ -1024,6 +1094,46 @@
           <w:bottom w:val="dotted" w:sz="4" w:space="1" w:color="A0A0A0"/>
         </w:pBdr>
       </w:pPr>
+    </w:p>
+    <w:p>
+      <w:pPr>
+        <w:spacing w:after="0"/>
+        <w:pBdr>
+          <w:bottom w:val="dotted" w:sz="4" w:space="1" w:color="A0A0A0"/>
+        </w:pBdr>
+      </w:pPr>
+    </w:p>
+    <w:p>
+      <w:pPr>
+        <w:spacing w:after="0"/>
+        <w:pBdr>
+          <w:bottom w:val="dotted" w:sz="4" w:space="1" w:color="A0A0A0"/>
+        </w:pBdr>
+      </w:pPr>
+    </w:p>
+    <w:p>
+      <w:pPr>
+        <w:spacing w:after="40"/>
+      </w:pPr>
+    </w:p>
+    <w:p>
+      <w:pPr>
+        <w:tabs>
+          <w:tab w:pos="567" w:val="left"/>
+        </w:tabs>
+        <w:spacing w:after="80"/>
+        <w:ind w:left="567" w:hanging="567"/>
+      </w:pPr>
+      <w:r>
+        <w:rPr>
+          <w:b/>
+        </w:rPr>
+        <w:t>B4.</w:t>
+        <w:tab/>
+      </w:r>
+      <w:r>
+        <w:t>The Knee x slider moves the shaft. If L were 30 m instead of 42.4 m, by what factor would z_max and T change?</w:t>
+      </w:r>
     </w:p>
     <w:p>
       <w:pPr>
@@ -1063,7 +1173,7 @@
           <w:b w:val="0"/>
           <w:i w:val="0"/>
         </w:rPr>
-        <w:t>The power delivered to the turbines is the flow times the head left after friction in the penstock:</w:t>
+        <w:t>The power in the jet is the discharge times the head left after friction in the headrace and the penstock together, per metre of width. H is the reservoir level above the nozzle axis, H = 24.9 − 3.0 = 21.9 m, and h_f = k_t·q² is the friction in both:</w:t>
       </w:r>
     </w:p>
     <w:p>
@@ -1076,22 +1186,39 @@
           <w:rFonts w:ascii="Cambria Math" w:hAnsi="Cambria Math" w:eastAsia="Cambria Math"/>
           <w:sz w:val="23"/>
         </w:rPr>
-        <w:t>P = ρ·g·Q·(H − h_f)            h_f = k_p·Q²,   k_p = λ·L_p / (D_p · 2g · A_p²)</w:t>
+        <w:t>P = ρ·g·q·(H − h_f)            h_f = k_t·q²</w:t>
       </w:r>
     </w:p>
     <w:p>
       <w:pPr>
-        <w:pStyle w:val="ListNumber"/>
         <w:spacing w:after="80"/>
+        <w:ind w:left="680"/>
+      </w:pPr>
+      <w:r>
+        <w:rPr>
+          <w:rFonts w:ascii="Cambria Math" w:hAnsi="Cambria Math" w:eastAsia="Cambria Math"/>
+          <w:sz w:val="23"/>
+        </w:rPr>
+        <w:t>k_t = f·(L/D_Hh)/(2g·D_h²) + f·(L_p/D_Hp)/(2g·D_p²),      D_Hh = 2·D_h,   D_Hp = 2·D_p,   L_p = 20 m</w:t>
+      </w:r>
+    </w:p>
+    <w:p>
+      <w:pPr>
+        <w:tabs>
+          <w:tab w:pos="567" w:val="left"/>
+        </w:tabs>
+        <w:spacing w:after="80"/>
+        <w:ind w:left="567" w:hanging="567"/>
       </w:pPr>
       <w:r>
         <w:rPr>
           <w:b/>
         </w:rPr>
         <w:t>C1.</w:t>
+        <w:tab/>
       </w:r>
       <w:r>
-        <w:t xml:space="preserve"> Show that P is greatest when h_f = H/3, whatever k_p is (set dP/dQ = 0).</w:t>
+        <w:t>Show that P is greatest when h_f = H/3, whatever k_t is (set dP/dq = 0).</w:t>
       </w:r>
     </w:p>
     <w:p>
@@ -1125,17 +1252,21 @@
     </w:p>
     <w:p>
       <w:pPr>
-        <w:pStyle w:val="ListNumber"/>
+        <w:tabs>
+          <w:tab w:pos="567" w:val="left"/>
+        </w:tabs>
         <w:spacing w:after="80"/>
+        <w:ind w:left="567" w:hanging="567"/>
       </w:pPr>
       <w:r>
         <w:rPr>
           <w:b/>
         </w:rPr>
         <w:t>C2.</w:t>
+        <w:tab/>
       </w:r>
       <w:r>
-        <w:t xml:space="preserve"> For the penstock (λ = 0.024, L_p = 1700 m, D_p = 3 m) and the gross head H = 1705 − 772 m, find the flow that transmits the most power and that power.</w:t>
+        <w:t>At the design point q₀: find h_f (headrace and penstock), the jet speed u_jet = √(2g·(H − h_f)) and the power P = ρ·g·q₀·(H − h_f), and check that it equals ½·ρ·q₀·u_jet². On screen: Field → Speed, then hover the jet just past the nozzle (the app reads about 20.6 m/s).</w:t>
       </w:r>
     </w:p>
     <w:p>
@@ -1169,17 +1300,21 @@
     </w:p>
     <w:p>
       <w:pPr>
-        <w:pStyle w:val="ListNumber"/>
+        <w:tabs>
+          <w:tab w:pos="567" w:val="left"/>
+        </w:tabs>
         <w:spacing w:after="80"/>
+        <w:ind w:left="567" w:hanging="567"/>
       </w:pPr>
       <w:r>
         <w:rPr>
           <w:b/>
         </w:rPr>
         <w:t>C3.</w:t>
+        <w:tab/>
       </w:r>
       <w:r>
-        <w:t xml:space="preserve"> Find the friction loss and the power at the stated design flow of 217 m³/s through this one penstock. Which side of the peak is it on, and what does that say about the sketch of the scheme?</w:t>
+        <w:t>Find the discharge q* = √(H/(3·k_t)) that would put a third of the head into friction, the jet speed at that point, √(2g·2H/3), and the nozzle opening it would need, q*/u_jet. Compare the opening with the penstock bore (2.4 m) and with the top of the Nozzle gap slider (1.2 m, about 18 m²/s). Where does the peak lie on this scheme, and what will the jet speed and the power do as you open the gap?</w:t>
       </w:r>
     </w:p>
     <w:p>
@@ -1216,216 +1351,45 @@
         <w:pStyle w:val="Heading1"/>
       </w:pPr>
       <w:r>
-        <w:t>Part D — Before the session: predict your own tower</w:t>
+        <w:t>Part D — In the session</w:t>
       </w:r>
     </w:p>
     <w:p>
       <w:pPr>
-        <w:spacing w:after="40"/>
-      </w:pPr>
-      <w:r>
-        <w:rPr>
-          <w:b w:val="0"/>
-          <w:i w:val="0"/>
-        </w:rPr>
-        <w:t>In the session you run the same calculation on a scheme the solver can hold — a vertical slice one metre wide, so areas are heights and A/A_s = D_h/D_s — and then measure it. Its constants, measured with the app:</w:t>
-      </w:r>
-    </w:p>
-    <w:tbl>
-      <w:tblPr>
-        <w:tblStyle w:val="TableGrid"/>
-        <w:tblW w:type="auto" w:w="0"/>
-        <w:jc w:val="center"/>
-        <w:tblLook w:firstColumn="1" w:firstRow="1" w:lastColumn="0" w:lastRow="0" w:noHBand="0" w:noVBand="1" w:val="04A0"/>
-      </w:tblPr>
-      <w:tblGrid>
-        <w:gridCol w:w="4873"/>
-        <w:gridCol w:w="4873"/>
-      </w:tblGrid>
-      <w:tr>
-        <w:tc>
-          <w:tcPr>
-            <w:tcW w:type="dxa" w:w="2551"/>
-          </w:tcPr>
-          <w:p>
-            <w:r/>
-            <w:r>
-              <w:rPr>
-                <w:sz w:val="20"/>
-              </w:rPr>
-              <w:t>headrace length L</w:t>
-            </w:r>
-          </w:p>
-        </w:tc>
-        <w:tc>
-          <w:tcPr>
-            <w:tcW w:type="dxa" w:w="6520"/>
-          </w:tcPr>
-          <w:p>
-            <w:r/>
-            <w:r>
-              <w:rPr>
-                <w:sz w:val="20"/>
-              </w:rPr>
-              <w:t>42.4 m (reservoir wall to shaft centre)</w:t>
-            </w:r>
-          </w:p>
-        </w:tc>
-      </w:tr>
-      <w:tr>
-        <w:tc>
-          <w:tcPr>
-            <w:tcW w:type="dxa" w:w="2551"/>
-          </w:tcPr>
-          <w:p>
-            <w:r/>
-            <w:r>
-              <w:rPr>
-                <w:sz w:val="20"/>
-              </w:rPr>
-              <w:t>headrace bore D_h</w:t>
-            </w:r>
-          </w:p>
-        </w:tc>
-        <w:tc>
-          <w:tcPr>
-            <w:tcW w:type="dxa" w:w="6520"/>
-          </w:tcPr>
-          <w:p>
-            <w:r/>
-            <w:r>
-              <w:rPr>
-                <w:sz w:val="20"/>
-              </w:rPr>
-              <w:t>3.05 m</w:t>
-            </w:r>
-          </w:p>
-        </w:tc>
-      </w:tr>
-      <w:tr>
-        <w:tc>
-          <w:tcPr>
-            <w:tcW w:type="dxa" w:w="2551"/>
-          </w:tcPr>
-          <w:p>
-            <w:r/>
-            <w:r>
-              <w:rPr>
-                <w:sz w:val="20"/>
-              </w:rPr>
-              <w:t>headrace velocity u₀</w:t>
-            </w:r>
-          </w:p>
-        </w:tc>
-        <w:tc>
-          <w:tcPr>
-            <w:tcW w:type="dxa" w:w="6520"/>
-          </w:tcPr>
-          <w:p>
-            <w:r/>
-            <w:r>
-              <w:rPr>
-                <w:sz w:val="20"/>
-              </w:rPr>
-              <w:t>2.5 m/s</w:t>
-            </w:r>
-          </w:p>
-        </w:tc>
-      </w:tr>
-      <w:tr>
-        <w:tc>
-          <w:tcPr>
-            <w:tcW w:type="dxa" w:w="2551"/>
-          </w:tcPr>
-          <w:p>
-            <w:r/>
-            <w:r>
-              <w:rPr>
-                <w:sz w:val="20"/>
-              </w:rPr>
-              <w:t>steady drawdown z₀</w:t>
-            </w:r>
-          </w:p>
-        </w:tc>
-        <w:tc>
-          <w:tcPr>
-            <w:tcW w:type="dxa" w:w="6520"/>
-          </w:tcPr>
-          <w:p>
-            <w:r/>
-            <w:r>
-              <w:rPr>
-                <w:sz w:val="20"/>
-              </w:rPr>
-              <w:t>0.35 m  (k = z₀/u₀² = 0.056 s²/m — mostly velocity head, u₀²/2g = 0.32 m)</w:t>
-            </w:r>
-          </w:p>
-        </w:tc>
-      </w:tr>
-      <w:tr>
-        <w:tc>
-          <w:tcPr>
-            <w:tcW w:type="dxa" w:w="2551"/>
-          </w:tcPr>
-          <w:p>
-            <w:r/>
-            <w:r>
-              <w:rPr>
-                <w:sz w:val="20"/>
-              </w:rPr>
-              <w:t>your shaft width D_s</w:t>
-            </w:r>
-          </w:p>
-        </w:tc>
-        <w:tc>
-          <w:tcPr>
-            <w:tcW w:type="dxa" w:w="6520"/>
-          </w:tcPr>
-          <w:p>
-            <w:r/>
-            <w:r>
-              <w:rPr>
-                <w:sz w:val="20"/>
-              </w:rPr>
-              <w:t>2.5 + 0.5·d metres, d the last digit of your student number</w:t>
-            </w:r>
-          </w:p>
-        </w:tc>
-      </w:tr>
-    </w:tbl>
-    <w:p>
-      <w:pPr>
-        <w:spacing w:after="40"/>
-      </w:pPr>
-    </w:p>
-    <w:p>
-      <w:pPr>
-        <w:pStyle w:val="ListNumber"/>
+        <w:tabs>
+          <w:tab w:pos="567" w:val="left"/>
+        </w:tabs>
         <w:spacing w:after="80"/>
+        <w:ind w:left="567" w:hanging="567"/>
       </w:pPr>
       <w:r>
         <w:rPr>
           <w:b/>
         </w:rPr>
         <w:t>D1.</w:t>
+        <w:tab/>
       </w:r>
       <w:r>
-        <w:t xml:space="preserve"> With your own D_s: the frictionless upsurge u₀·√(L·D_h/(g·D_s)), the crest with friction (the B2 method, with k = 0.056), and the period. Write them in the table.</w:t>
+        <w:t>Fill the predicted column from Parts A–C for your digit.</w:t>
       </w:r>
     </w:p>
     <w:p>
       <w:pPr>
-        <w:pStyle w:val="ListNumber"/>
+        <w:tabs>
+          <w:tab w:pos="567" w:val="left"/>
+        </w:tabs>
         <w:spacing w:after="80"/>
+        <w:ind w:left="567" w:hanging="567"/>
       </w:pPr>
       <w:r>
         <w:rPr>
           <w:b/>
         </w:rPr>
         <w:t>D2.</w:t>
+        <w:tab/>
       </w:r>
       <w:r>
-        <w:t xml:space="preserve"> In the session you will read u₀, z₀, the rise of the shaft above its steady level and T. Note z_max = rise − z₀. Compare with D1; the class then pools every width into one curve.</w:t>
+        <w:t>In the session, read u₀ (hover the headrace), z₀ (reservoir gauge minus shaft gauge), the rise of the shaft above its steady level after the slam, and T from the first crest to the second; z_max = rise − z₀. The class then pools every width into one curve.</w:t>
       </w:r>
     </w:p>
     <w:tbl>
@@ -1443,7 +1407,7 @@
       <w:tr>
         <w:tc>
           <w:tcPr>
-            <w:tcW w:type="dxa" w:w="3402"/>
+            <w:tcW w:type="dxa" w:w="3742"/>
           </w:tcPr>
           <w:p>
             <w:r/>
@@ -1489,7 +1453,7 @@
       <w:tr>
         <w:tc>
           <w:tcPr>
-            <w:tcW w:type="dxa" w:w="3402"/>
+            <w:tcW w:type="dxa" w:w="3742"/>
           </w:tcPr>
           <w:p>
             <w:r/>
@@ -1531,7 +1495,7 @@
       <w:tr>
         <w:tc>
           <w:tcPr>
-            <w:tcW w:type="dxa" w:w="3402"/>
+            <w:tcW w:type="dxa" w:w="3742"/>
           </w:tcPr>
           <w:p>
             <w:r/>
@@ -1553,7 +1517,6 @@
               <w:rPr>
                 <w:sz w:val="20"/>
               </w:rPr>
-              <w:t>2.5</w:t>
             </w:r>
           </w:p>
         </w:tc>
@@ -1574,7 +1537,7 @@
       <w:tr>
         <w:tc>
           <w:tcPr>
-            <w:tcW w:type="dxa" w:w="3402"/>
+            <w:tcW w:type="dxa" w:w="3742"/>
           </w:tcPr>
           <w:p>
             <w:r/>
@@ -1596,7 +1559,6 @@
               <w:rPr>
                 <w:sz w:val="20"/>
               </w:rPr>
-              <w:t>0.35</w:t>
             </w:r>
           </w:p>
         </w:tc>
@@ -1617,7 +1579,7 @@
       <w:tr>
         <w:tc>
           <w:tcPr>
-            <w:tcW w:type="dxa" w:w="3402"/>
+            <w:tcW w:type="dxa" w:w="3742"/>
           </w:tcPr>
           <w:p>
             <w:r/>
@@ -1660,7 +1622,7 @@
       <w:tr>
         <w:tc>
           <w:tcPr>
-            <w:tcW w:type="dxa" w:w="3402"/>
+            <w:tcW w:type="dxa" w:w="3742"/>
           </w:tcPr>
           <w:p>
             <w:r/>
@@ -1702,7 +1664,7 @@
       <w:tr>
         <w:tc>
           <w:tcPr>
-            <w:tcW w:type="dxa" w:w="3402"/>
+            <w:tcW w:type="dxa" w:w="3742"/>
           </w:tcPr>
           <w:p>
             <w:r/>
@@ -1744,7 +1706,7 @@
       <w:tr>
         <w:tc>
           <w:tcPr>
-            <w:tcW w:type="dxa" w:w="3402"/>
+            <w:tcW w:type="dxa" w:w="3742"/>
           </w:tcPr>
           <w:p>
             <w:r/>
@@ -1766,7 +1728,91 @@
               <w:rPr>
                 <w:sz w:val="20"/>
               </w:rPr>
-              <w:t>—</w:t>
+              <w:t>0.03</w:t>
+            </w:r>
+          </w:p>
+        </w:tc>
+        <w:tc>
+          <w:tcPr>
+            <w:tcW w:type="dxa" w:w="2551"/>
+          </w:tcPr>
+          <w:p>
+            <w:r/>
+            <w:r>
+              <w:rPr>
+                <w:sz w:val="20"/>
+              </w:rPr>
+            </w:r>
+          </w:p>
+        </w:tc>
+      </w:tr>
+      <w:tr>
+        <w:tc>
+          <w:tcPr>
+            <w:tcW w:type="dxa" w:w="3742"/>
+          </w:tcPr>
+          <w:p>
+            <w:r/>
+            <w:r>
+              <w:rPr>
+                <w:sz w:val="20"/>
+              </w:rPr>
+              <w:t>u_jet (m/s) (optional)</w:t>
+            </w:r>
+          </w:p>
+        </w:tc>
+        <w:tc>
+          <w:tcPr>
+            <w:tcW w:type="dxa" w:w="2551"/>
+          </w:tcPr>
+          <w:p>
+            <w:r/>
+            <w:r>
+              <w:rPr>
+                <w:sz w:val="20"/>
+              </w:rPr>
+            </w:r>
+          </w:p>
+        </w:tc>
+        <w:tc>
+          <w:tcPr>
+            <w:tcW w:type="dxa" w:w="2551"/>
+          </w:tcPr>
+          <w:p>
+            <w:r/>
+            <w:r>
+              <w:rPr>
+                <w:sz w:val="20"/>
+              </w:rPr>
+            </w:r>
+          </w:p>
+        </w:tc>
+      </w:tr>
+      <w:tr>
+        <w:tc>
+          <w:tcPr>
+            <w:tcW w:type="dxa" w:w="3742"/>
+          </w:tcPr>
+          <w:p>
+            <w:r/>
+            <w:r>
+              <w:rPr>
+                <w:sz w:val="20"/>
+              </w:rPr>
+              <w:t>P per metre of width (MW) (optional)</w:t>
+            </w:r>
+          </w:p>
+        </w:tc>
+        <w:tc>
+          <w:tcPr>
+            <w:tcW w:type="dxa" w:w="2551"/>
+          </w:tcPr>
+          <w:p>
+            <w:r/>
+            <w:r>
+              <w:rPr>
+                <w:sz w:val="20"/>
+              </w:rPr>
             </w:r>
           </w:p>
         </w:tc>
@@ -1791,18 +1837,6 @@
       </w:pPr>
     </w:p>
     <w:p>
-      <w:pPr>
-        <w:spacing w:after="120"/>
-      </w:pPr>
-      <w:r>
-        <w:rPr>
-          <w:b w:val="0"/>
-          <w:i w:val="0"/>
-        </w:rPr>
-        <w:t>Why the model's headrace is nearly frictionless: it is 14 diameters long against Grand'Maison's 1000. The friction factor itself comes out a realistic 0.03 — the loss is small because the pipe is short.</w:t>
-      </w:r>
-    </w:p>
-    <w:p>
       <w:r>
         <w:br w:type="page"/>
       </w:r>
@@ -1824,7 +1858,7 @@
           <w:b w:val="0"/>
           <w:i/>
         </w:rPr>
-        <w:t>Computed from the data above; two or three significant figures are all the question supports.</w:t>
+        <w:t>Computed from the scheme's constants; two or three significant figures are all the readings support.</w:t>
       </w:r>
     </w:p>
     <w:tbl>
@@ -1841,7 +1875,7 @@
       <w:tr>
         <w:tc>
           <w:tcPr>
-            <w:tcW w:type="dxa" w:w="2381"/>
+            <w:tcW w:type="dxa" w:w="2268"/>
           </w:tcPr>
           <w:p>
             <w:r/>
@@ -1854,7 +1888,7 @@
         </w:tc>
         <w:tc>
           <w:tcPr>
-            <w:tcW w:type="dxa" w:w="6690"/>
+            <w:tcW w:type="dxa" w:w="7143"/>
           </w:tcPr>
           <w:p>
             <w:r/>
@@ -1869,7 +1903,7 @@
       <w:tr>
         <w:tc>
           <w:tcPr>
-            <w:tcW w:type="dxa" w:w="2381"/>
+            <w:tcW w:type="dxa" w:w="2268"/>
           </w:tcPr>
           <w:p>
             <w:r/>
@@ -1877,13 +1911,13 @@
               <w:rPr>
                 <w:sz w:val="20"/>
               </w:rPr>
-              <w:t>A1  headrace area, velocity</w:t>
+              <w:t>A1  headrace velocity</w:t>
             </w:r>
           </w:p>
         </w:tc>
         <w:tc>
           <w:tcPr>
-            <w:tcW w:type="dxa" w:w="6690"/>
+            <w:tcW w:type="dxa" w:w="7143"/>
           </w:tcPr>
           <w:p>
             <w:r/>
@@ -1891,7 +1925,7 @@
               <w:rPr>
                 <w:sz w:val="20"/>
               </w:rPr>
-              <w:t>A = 46.6 m²,  u₀ = 4.66 m/s</w:t>
+              <w:t>u₀ = q₀/D_h = 7.6/3.05 = 2.49 m/s</w:t>
             </w:r>
           </w:p>
         </w:tc>
@@ -1899,7 +1933,7 @@
       <w:tr>
         <w:tc>
           <w:tcPr>
-            <w:tcW w:type="dxa" w:w="2381"/>
+            <w:tcW w:type="dxa" w:w="2268"/>
           </w:tcPr>
           <w:p>
             <w:r/>
@@ -1907,13 +1941,13 @@
               <w:rPr>
                 <w:sz w:val="20"/>
               </w:rPr>
-              <w:t>A2  friction loss, tower level</w:t>
+              <w:t>A2  friction loss</w:t>
             </w:r>
           </w:p>
         </w:tc>
         <w:tc>
           <w:tcPr>
-            <w:tcW w:type="dxa" w:w="6690"/>
+            <w:tcW w:type="dxa" w:w="7143"/>
           </w:tcPr>
           <w:p>
             <w:r/>
@@ -1921,7 +1955,7 @@
               <w:rPr>
                 <w:sz w:val="20"/>
               </w:rPr>
-              <w:t>h_f = 0.024 × (7700/7.7) × 4.66²/19.62 = 26.6 m below the reservoir. The tower is open to the air and carries no flow, so its level is the piezometric head at the junction.</w:t>
+              <w:t>D_H = 2 × 3.05 = 6.1 m;  h_f = 0.03 × (42.4/6.1) × 2.49²/19.62 = 0.066 m</w:t>
             </w:r>
           </w:p>
         </w:tc>
@@ -1929,7 +1963,7 @@
       <w:tr>
         <w:tc>
           <w:tcPr>
-            <w:tcW w:type="dxa" w:w="2381"/>
+            <w:tcW w:type="dxa" w:w="2268"/>
           </w:tcPr>
           <w:p>
             <w:r/>
@@ -1937,13 +1971,13 @@
               <w:rPr>
                 <w:sz w:val="20"/>
               </w:rPr>
-              <w:t>A3  loss coefficient</w:t>
+              <w:t>A3  shaft level</w:t>
             </w:r>
           </w:p>
         </w:tc>
         <w:tc>
           <w:tcPr>
-            <w:tcW w:type="dxa" w:w="6690"/>
+            <w:tcW w:type="dxa" w:w="7143"/>
           </w:tcPr>
           <w:p>
             <w:r/>
@@ -1951,7 +1985,7 @@
               <w:rPr>
                 <w:sz w:val="20"/>
               </w:rPr>
-              <w:t>k = h_f/u₀² = 1.223 s²/m</w:t>
+              <w:t>u₀²/2g = 0.32 m, plus h_f = 0.066 m: z₀ = 0.38 m below the reservoir. The gauges read about 0.35 m and the shaft level wobbles by about ±0.1 m, so the 3 cm between prediction and reading is a fraction of the wobble and of one cell (0.16 m at Medium): the two agree as closely as the reading can be made. The shaft is a piezometer because it is open to the air and carries no flow; its level is the piezometric head at the knee.</w:t>
             </w:r>
           </w:p>
         </w:tc>
@@ -1959,7 +1993,7 @@
       <w:tr>
         <w:tc>
           <w:tcPr>
-            <w:tcW w:type="dxa" w:w="2381"/>
+            <w:tcW w:type="dxa" w:w="2268"/>
           </w:tcPr>
           <w:p>
             <w:r/>
@@ -1967,13 +2001,13 @@
               <w:rPr>
                 <w:sz w:val="20"/>
               </w:rPr>
-              <w:t>B1  frictionless</w:t>
+              <w:t>A4  loss coefficient</w:t>
             </w:r>
           </w:p>
         </w:tc>
         <w:tc>
           <w:tcPr>
-            <w:tcW w:type="dxa" w:w="6690"/>
+            <w:tcW w:type="dxa" w:w="7143"/>
           </w:tcPr>
           <w:p>
             <w:r/>
@@ -1981,157 +2015,7 @@
               <w:rPr>
                 <w:sz w:val="20"/>
               </w:rPr>
-              <w:t>A_s = 176.7 m²;  z_max = 4.66 × √(7700 × 46.6/(9.81 × 176.7)) = 67.0 m;  T = 343 s (5.7 min)</w:t>
-            </w:r>
-          </w:p>
-        </w:tc>
-      </w:tr>
-      <w:tr>
-        <w:tc>
-          <w:tcPr>
-            <w:tcW w:type="dxa" w:w="2381"/>
-          </w:tcPr>
-          <w:p>
-            <w:r/>
-            <w:r>
-              <w:rPr>
-                <w:sz w:val="20"/>
-              </w:rPr>
-              <w:t>B2  with friction</w:t>
-            </w:r>
-          </w:p>
-        </w:tc>
-        <w:tc>
-          <w:tcPr>
-            <w:tcW w:type="dxa" w:w="6690"/>
-          </w:tcPr>
-          <w:p>
-            <w:r/>
-            <w:r>
-              <w:rPr>
-                <w:sz w:val="20"/>
-              </w:rPr>
-              <w:t>Z = 84.5 m,  C = -50.5 m²/s². Trial on 0 = C·e^(z/Z) + (z + Z)/k: the root is z = -50.6 m, i.e. 50.6 m ABOVE the reservoir. (Check: (z + Z)/k = 27.7, C·e^(z/Z) = -27.7.)</w:t>
-            </w:r>
-          </w:p>
-        </w:tc>
-      </w:tr>
-      <w:tr>
-        <w:tc>
-          <w:tcPr>
-            <w:tcW w:type="dxa" w:w="2381"/>
-          </w:tcPr>
-          <w:p>
-            <w:r/>
-            <w:r>
-              <w:rPr>
-                <w:sz w:val="20"/>
-              </w:rPr>
-              <w:t>B3  height</w:t>
-            </w:r>
-          </w:p>
-        </w:tc>
-        <w:tc>
-          <w:tcPr>
-            <w:tcW w:type="dxa" w:w="6690"/>
-          </w:tcPr>
-          <w:p>
-            <w:r/>
-            <w:r>
-              <w:rPr>
-                <w:sz w:val="20"/>
-              </w:rPr>
-              <w:t>Friction takes 16 m off the 67 m frictionless rise. The water reaches 50.6 m above reservoir level; with the tower base at 1705 m and 3 m of freeboard adopt a tower of about 55 m (top ≈ 1760 m). Compare the worked example's 1.95 m on a 1400 m tunnel: at Grand'Maison the column is 5.5 times longer and 1.7 times faster, and the tower area is 25 times larger.</w:t>
-            </w:r>
-          </w:p>
-        </w:tc>
-      </w:tr>
-      <w:tr>
-        <w:tc>
-          <w:tcPr>
-            <w:tcW w:type="dxa" w:w="2381"/>
-          </w:tcPr>
-          <w:p>
-            <w:r/>
-            <w:r>
-              <w:rPr>
-                <w:sz w:val="20"/>
-              </w:rPr>
-              <w:t>C1</w:t>
-            </w:r>
-          </w:p>
-        </w:tc>
-        <w:tc>
-          <w:tcPr>
-            <w:tcW w:type="dxa" w:w="6690"/>
-          </w:tcPr>
-          <w:p>
-            <w:r/>
-            <w:r>
-              <w:rPr>
-                <w:sz w:val="20"/>
-              </w:rPr>
-              <w:t>P = ρgQ(H − k_pQ²); dP/dQ = ρg(H − 3k_pQ²) = 0 ⇒ k_pQ² = H/3 = h_f.</w:t>
-            </w:r>
-          </w:p>
-        </w:tc>
-      </w:tr>
-      <w:tr>
-        <w:tc>
-          <w:tcPr>
-            <w:tcW w:type="dxa" w:w="2381"/>
-          </w:tcPr>
-          <w:p>
-            <w:r/>
-            <w:r>
-              <w:rPr>
-                <w:sz w:val="20"/>
-              </w:rPr>
-              <w:t>C2</w:t>
-            </w:r>
-          </w:p>
-        </w:tc>
-        <w:tc>
-          <w:tcPr>
-            <w:tcW w:type="dxa" w:w="6690"/>
-          </w:tcPr>
-          <w:p>
-            <w:r/>
-            <w:r>
-              <w:rPr>
-                <w:sz w:val="20"/>
-              </w:rPr>
-              <w:t>A_p = 7.07 m², k_p = 0.024 × (1700/3)/(19.62 × 7.1²) = 0.01387 s²/m⁵; H = 933 m; Q* = √(H/3k_p) = 150 m³/s, h_f = 311 m, P* = ρgQ*(2H/3) = 914 MW.</w:t>
-            </w:r>
-          </w:p>
-        </w:tc>
-      </w:tr>
-      <w:tr>
-        <w:tc>
-          <w:tcPr>
-            <w:tcW w:type="dxa" w:w="2381"/>
-          </w:tcPr>
-          <w:p>
-            <w:r/>
-            <w:r>
-              <w:rPr>
-                <w:sz w:val="20"/>
-              </w:rPr>
-              <w:t>C3</w:t>
-            </w:r>
-          </w:p>
-        </w:tc>
-        <w:tc>
-          <w:tcPr>
-            <w:tcW w:type="dxa" w:w="6690"/>
-          </w:tcPr>
-          <w:p>
-            <w:r/>
-            <w:r>
-              <w:rPr>
-                <w:sz w:val="20"/>
-              </w:rPr>
-              <w:t>At 217 m³/s: h_f = 653 m (70% of the head), P = 595 MW — past the peak and below it. One 3 m penstock cannot carry the design flow efficiently; the real scheme splits the flow between several penstocks and units, and the single line in the sketch is a simplification.</w:t>
+              <w:t>k = z₀/u₀² = 0.382/6.209 = 0.0616 s²/m</w:t>
             </w:r>
           </w:p>
         </w:tc>
@@ -2151,7 +2035,7 @@
           <w:b/>
           <w:i w:val="0"/>
         </w:rPr>
-        <w:t>D1 — the class rig, per digit (k = 0.056 s²/m, u₀ = 2.5 m/s, L = 42.4 m, D_h = 3.05 m):</w:t>
+        <w:t>B1–B2, per digit (u₀ = 2.49 m/s, z₀ = 0.382 m, k = 0.0616 s²/m, L = 42.4 m, D_h = 3.05 m; Z = L·D_h/(2·g·k·D_s) = 107.0/D_s m and C = −(Z/k)·e^(−z₀/Z)). The with-friction column is the crest equation solved by bisection:</w:t>
       </w:r>
     </w:p>
     <w:tbl>
@@ -2171,7 +2055,7 @@
       <w:tr>
         <w:tc>
           <w:tcPr>
-            <w:tcW w:type="dxa" w:w="850"/>
+            <w:tcW w:type="dxa" w:w="680"/>
           </w:tcPr>
           <w:p>
             <w:r/>
@@ -2186,7 +2070,7 @@
         </w:tc>
         <w:tc>
           <w:tcPr>
-            <w:tcW w:type="dxa" w:w="1417"/>
+            <w:tcW w:type="dxa" w:w="1247"/>
           </w:tcPr>
           <w:p>
             <w:r/>
@@ -2201,7 +2085,7 @@
         </w:tc>
         <w:tc>
           <w:tcPr>
-            <w:tcW w:type="dxa" w:w="1984"/>
+            <w:tcW w:type="dxa" w:w="2494"/>
           </w:tcPr>
           <w:p>
             <w:r/>
@@ -2210,13 +2094,13 @@
                 <w:b/>
                 <w:sz w:val="20"/>
               </w:rPr>
-              <w:t>no friction (m)</w:t>
+              <w:t>z_max, no friction (m)</w:t>
             </w:r>
           </w:p>
         </w:tc>
         <w:tc>
           <w:tcPr>
-            <w:tcW w:type="dxa" w:w="1984"/>
+            <w:tcW w:type="dxa" w:w="2608"/>
           </w:tcPr>
           <w:p>
             <w:r/>
@@ -2225,13 +2109,13 @@
                 <w:b/>
                 <w:sz w:val="20"/>
               </w:rPr>
-              <w:t>with friction (m)</w:t>
+              <w:t>z_max, with friction (m)</w:t>
             </w:r>
           </w:p>
         </w:tc>
         <w:tc>
           <w:tcPr>
-            <w:tcW w:type="dxa" w:w="1417"/>
+            <w:tcW w:type="dxa" w:w="1247"/>
           </w:tcPr>
           <w:p>
             <w:r/>
@@ -2248,7 +2132,7 @@
       <w:tr>
         <w:tc>
           <w:tcPr>
-            <w:tcW w:type="dxa" w:w="850"/>
+            <w:tcW w:type="dxa" w:w="680"/>
           </w:tcPr>
           <w:p>
             <w:r/>
@@ -2262,7 +2146,7 @@
         </w:tc>
         <w:tc>
           <w:tcPr>
-            <w:tcW w:type="dxa" w:w="1417"/>
+            <w:tcW w:type="dxa" w:w="1247"/>
           </w:tcPr>
           <w:p>
             <w:r/>
@@ -2276,7 +2160,7 @@
         </w:tc>
         <w:tc>
           <w:tcPr>
-            <w:tcW w:type="dxa" w:w="1984"/>
+            <w:tcW w:type="dxa" w:w="2494"/>
           </w:tcPr>
           <w:p>
             <w:r/>
@@ -2284,13 +2168,13 @@
               <w:rPr>
                 <w:sz w:val="20"/>
               </w:rPr>
-              <w:t>5.74</w:t>
+              <w:t>5.72</w:t>
             </w:r>
           </w:p>
         </w:tc>
         <w:tc>
           <w:tcPr>
-            <w:tcW w:type="dxa" w:w="1984"/>
+            <w:tcW w:type="dxa" w:w="2608"/>
           </w:tcPr>
           <w:p>
             <w:r/>
@@ -2298,13 +2182,13 @@
               <w:rPr>
                 <w:sz w:val="20"/>
               </w:rPr>
-              <w:t>5.51</w:t>
+              <w:t>5.47</w:t>
             </w:r>
           </w:p>
         </w:tc>
         <w:tc>
           <w:tcPr>
-            <w:tcW w:type="dxa" w:w="1417"/>
+            <w:tcW w:type="dxa" w:w="1247"/>
           </w:tcPr>
           <w:p>
             <w:r/>
@@ -2320,7 +2204,7 @@
       <w:tr>
         <w:tc>
           <w:tcPr>
-            <w:tcW w:type="dxa" w:w="850"/>
+            <w:tcW w:type="dxa" w:w="680"/>
           </w:tcPr>
           <w:p>
             <w:r/>
@@ -2334,7 +2218,7 @@
         </w:tc>
         <w:tc>
           <w:tcPr>
-            <w:tcW w:type="dxa" w:w="1417"/>
+            <w:tcW w:type="dxa" w:w="1247"/>
           </w:tcPr>
           <w:p>
             <w:r/>
@@ -2348,7 +2232,7 @@
         </w:tc>
         <w:tc>
           <w:tcPr>
-            <w:tcW w:type="dxa" w:w="1984"/>
+            <w:tcW w:type="dxa" w:w="2494"/>
           </w:tcPr>
           <w:p>
             <w:r/>
@@ -2356,13 +2240,13 @@
               <w:rPr>
                 <w:sz w:val="20"/>
               </w:rPr>
-              <w:t>5.24</w:t>
+              <w:t>5.22</w:t>
             </w:r>
           </w:p>
         </w:tc>
         <w:tc>
           <w:tcPr>
-            <w:tcW w:type="dxa" w:w="1984"/>
+            <w:tcW w:type="dxa" w:w="2608"/>
           </w:tcPr>
           <w:p>
             <w:r/>
@@ -2370,13 +2254,13 @@
               <w:rPr>
                 <w:sz w:val="20"/>
               </w:rPr>
-              <w:t>5.01</w:t>
+              <w:t>4.97</w:t>
             </w:r>
           </w:p>
         </w:tc>
         <w:tc>
           <w:tcPr>
-            <w:tcW w:type="dxa" w:w="1417"/>
+            <w:tcW w:type="dxa" w:w="1247"/>
           </w:tcPr>
           <w:p>
             <w:r/>
@@ -2392,7 +2276,7 @@
       <w:tr>
         <w:tc>
           <w:tcPr>
-            <w:tcW w:type="dxa" w:w="850"/>
+            <w:tcW w:type="dxa" w:w="680"/>
           </w:tcPr>
           <w:p>
             <w:r/>
@@ -2406,7 +2290,7 @@
         </w:tc>
         <w:tc>
           <w:tcPr>
-            <w:tcW w:type="dxa" w:w="1417"/>
+            <w:tcW w:type="dxa" w:w="1247"/>
           </w:tcPr>
           <w:p>
             <w:r/>
@@ -2420,7 +2304,7 @@
         </w:tc>
         <w:tc>
           <w:tcPr>
-            <w:tcW w:type="dxa" w:w="1984"/>
+            <w:tcW w:type="dxa" w:w="2494"/>
           </w:tcPr>
           <w:p>
             <w:r/>
@@ -2428,13 +2312,13 @@
               <w:rPr>
                 <w:sz w:val="20"/>
               </w:rPr>
-              <w:t>4.85</w:t>
+              <w:t>4.84</w:t>
             </w:r>
           </w:p>
         </w:tc>
         <w:tc>
           <w:tcPr>
-            <w:tcW w:type="dxa" w:w="1984"/>
+            <w:tcW w:type="dxa" w:w="2608"/>
           </w:tcPr>
           <w:p>
             <w:r/>
@@ -2442,13 +2326,13 @@
               <w:rPr>
                 <w:sz w:val="20"/>
               </w:rPr>
-              <w:t>4.62</w:t>
+              <w:t>4.58</w:t>
             </w:r>
           </w:p>
         </w:tc>
         <w:tc>
           <w:tcPr>
-            <w:tcW w:type="dxa" w:w="1417"/>
+            <w:tcW w:type="dxa" w:w="1247"/>
           </w:tcPr>
           <w:p>
             <w:r/>
@@ -2464,7 +2348,7 @@
       <w:tr>
         <w:tc>
           <w:tcPr>
-            <w:tcW w:type="dxa" w:w="850"/>
+            <w:tcW w:type="dxa" w:w="680"/>
           </w:tcPr>
           <w:p>
             <w:r/>
@@ -2478,7 +2362,7 @@
         </w:tc>
         <w:tc>
           <w:tcPr>
-            <w:tcW w:type="dxa" w:w="1417"/>
+            <w:tcW w:type="dxa" w:w="1247"/>
           </w:tcPr>
           <w:p>
             <w:r/>
@@ -2492,7 +2376,7 @@
         </w:tc>
         <w:tc>
           <w:tcPr>
-            <w:tcW w:type="dxa" w:w="1984"/>
+            <w:tcW w:type="dxa" w:w="2494"/>
           </w:tcPr>
           <w:p>
             <w:r/>
@@ -2500,13 +2384,13 @@
               <w:rPr>
                 <w:sz w:val="20"/>
               </w:rPr>
-              <w:t>4.54</w:t>
+              <w:t>4.52</w:t>
             </w:r>
           </w:p>
         </w:tc>
         <w:tc>
           <w:tcPr>
-            <w:tcW w:type="dxa" w:w="1984"/>
+            <w:tcW w:type="dxa" w:w="2608"/>
           </w:tcPr>
           <w:p>
             <w:r/>
@@ -2514,13 +2398,13 @@
               <w:rPr>
                 <w:sz w:val="20"/>
               </w:rPr>
-              <w:t>4.31</w:t>
+              <w:t>4.27</w:t>
             </w:r>
           </w:p>
         </w:tc>
         <w:tc>
           <w:tcPr>
-            <w:tcW w:type="dxa" w:w="1417"/>
+            <w:tcW w:type="dxa" w:w="1247"/>
           </w:tcPr>
           <w:p>
             <w:r/>
@@ -2536,7 +2420,7 @@
       <w:tr>
         <w:tc>
           <w:tcPr>
-            <w:tcW w:type="dxa" w:w="850"/>
+            <w:tcW w:type="dxa" w:w="680"/>
           </w:tcPr>
           <w:p>
             <w:r/>
@@ -2550,7 +2434,7 @@
         </w:tc>
         <w:tc>
           <w:tcPr>
-            <w:tcW w:type="dxa" w:w="1417"/>
+            <w:tcW w:type="dxa" w:w="1247"/>
           </w:tcPr>
           <w:p>
             <w:r/>
@@ -2564,7 +2448,7 @@
         </w:tc>
         <w:tc>
           <w:tcPr>
-            <w:tcW w:type="dxa" w:w="1984"/>
+            <w:tcW w:type="dxa" w:w="2494"/>
           </w:tcPr>
           <w:p>
             <w:r/>
@@ -2572,13 +2456,13 @@
               <w:rPr>
                 <w:sz w:val="20"/>
               </w:rPr>
-              <w:t>4.28</w:t>
+              <w:t>4.26</w:t>
             </w:r>
           </w:p>
         </w:tc>
         <w:tc>
           <w:tcPr>
-            <w:tcW w:type="dxa" w:w="1984"/>
+            <w:tcW w:type="dxa" w:w="2608"/>
           </w:tcPr>
           <w:p>
             <w:r/>
@@ -2586,13 +2470,13 @@
               <w:rPr>
                 <w:sz w:val="20"/>
               </w:rPr>
-              <w:t>4.05</w:t>
+              <w:t>4.01</w:t>
             </w:r>
           </w:p>
         </w:tc>
         <w:tc>
           <w:tcPr>
-            <w:tcW w:type="dxa" w:w="1417"/>
+            <w:tcW w:type="dxa" w:w="1247"/>
           </w:tcPr>
           <w:p>
             <w:r/>
@@ -2608,7 +2492,7 @@
       <w:tr>
         <w:tc>
           <w:tcPr>
-            <w:tcW w:type="dxa" w:w="850"/>
+            <w:tcW w:type="dxa" w:w="680"/>
           </w:tcPr>
           <w:p>
             <w:r/>
@@ -2622,7 +2506,7 @@
         </w:tc>
         <w:tc>
           <w:tcPr>
-            <w:tcW w:type="dxa" w:w="1417"/>
+            <w:tcW w:type="dxa" w:w="1247"/>
           </w:tcPr>
           <w:p>
             <w:r/>
@@ -2636,7 +2520,7 @@
         </w:tc>
         <w:tc>
           <w:tcPr>
-            <w:tcW w:type="dxa" w:w="1984"/>
+            <w:tcW w:type="dxa" w:w="2494"/>
           </w:tcPr>
           <w:p>
             <w:r/>
@@ -2644,13 +2528,13 @@
               <w:rPr>
                 <w:sz w:val="20"/>
               </w:rPr>
-              <w:t>4.06</w:t>
+              <w:t>4.05</w:t>
             </w:r>
           </w:p>
         </w:tc>
         <w:tc>
           <w:tcPr>
-            <w:tcW w:type="dxa" w:w="1984"/>
+            <w:tcW w:type="dxa" w:w="2608"/>
           </w:tcPr>
           <w:p>
             <w:r/>
@@ -2658,13 +2542,13 @@
               <w:rPr>
                 <w:sz w:val="20"/>
               </w:rPr>
-              <w:t>3.83</w:t>
+              <w:t>3.80</w:t>
             </w:r>
           </w:p>
         </w:tc>
         <w:tc>
           <w:tcPr>
-            <w:tcW w:type="dxa" w:w="1417"/>
+            <w:tcW w:type="dxa" w:w="1247"/>
           </w:tcPr>
           <w:p>
             <w:r/>
@@ -2680,7 +2564,7 @@
       <w:tr>
         <w:tc>
           <w:tcPr>
-            <w:tcW w:type="dxa" w:w="850"/>
+            <w:tcW w:type="dxa" w:w="680"/>
           </w:tcPr>
           <w:p>
             <w:r/>
@@ -2694,7 +2578,7 @@
         </w:tc>
         <w:tc>
           <w:tcPr>
-            <w:tcW w:type="dxa" w:w="1417"/>
+            <w:tcW w:type="dxa" w:w="1247"/>
           </w:tcPr>
           <w:p>
             <w:r/>
@@ -2708,7 +2592,7 @@
         </w:tc>
         <w:tc>
           <w:tcPr>
-            <w:tcW w:type="dxa" w:w="1984"/>
+            <w:tcW w:type="dxa" w:w="2494"/>
           </w:tcPr>
           <w:p>
             <w:r/>
@@ -2716,13 +2600,13 @@
               <w:rPr>
                 <w:sz w:val="20"/>
               </w:rPr>
-              <w:t>3.87</w:t>
+              <w:t>3.86</w:t>
             </w:r>
           </w:p>
         </w:tc>
         <w:tc>
           <w:tcPr>
-            <w:tcW w:type="dxa" w:w="1984"/>
+            <w:tcW w:type="dxa" w:w="2608"/>
           </w:tcPr>
           <w:p>
             <w:r/>
@@ -2730,13 +2614,13 @@
               <w:rPr>
                 <w:sz w:val="20"/>
               </w:rPr>
-              <w:t>3.64</w:t>
+              <w:t>3.61</w:t>
             </w:r>
           </w:p>
         </w:tc>
         <w:tc>
           <w:tcPr>
-            <w:tcW w:type="dxa" w:w="1417"/>
+            <w:tcW w:type="dxa" w:w="1247"/>
           </w:tcPr>
           <w:p>
             <w:r/>
@@ -2752,7 +2636,7 @@
       <w:tr>
         <w:tc>
           <w:tcPr>
-            <w:tcW w:type="dxa" w:w="850"/>
+            <w:tcW w:type="dxa" w:w="680"/>
           </w:tcPr>
           <w:p>
             <w:r/>
@@ -2766,7 +2650,7 @@
         </w:tc>
         <w:tc>
           <w:tcPr>
-            <w:tcW w:type="dxa" w:w="1417"/>
+            <w:tcW w:type="dxa" w:w="1247"/>
           </w:tcPr>
           <w:p>
             <w:r/>
@@ -2780,7 +2664,7 @@
         </w:tc>
         <w:tc>
           <w:tcPr>
-            <w:tcW w:type="dxa" w:w="1984"/>
+            <w:tcW w:type="dxa" w:w="2494"/>
           </w:tcPr>
           <w:p>
             <w:r/>
@@ -2788,13 +2672,13 @@
               <w:rPr>
                 <w:sz w:val="20"/>
               </w:rPr>
-              <w:t>3.71</w:t>
+              <w:t>3.69</w:t>
             </w:r>
           </w:p>
         </w:tc>
         <w:tc>
           <w:tcPr>
-            <w:tcW w:type="dxa" w:w="1984"/>
+            <w:tcW w:type="dxa" w:w="2608"/>
           </w:tcPr>
           <w:p>
             <w:r/>
@@ -2802,13 +2686,13 @@
               <w:rPr>
                 <w:sz w:val="20"/>
               </w:rPr>
-              <w:t>3.48</w:t>
+              <w:t>3.44</w:t>
             </w:r>
           </w:p>
         </w:tc>
         <w:tc>
           <w:tcPr>
-            <w:tcW w:type="dxa" w:w="1417"/>
+            <w:tcW w:type="dxa" w:w="1247"/>
           </w:tcPr>
           <w:p>
             <w:r/>
@@ -2824,7 +2708,7 @@
       <w:tr>
         <w:tc>
           <w:tcPr>
-            <w:tcW w:type="dxa" w:w="850"/>
+            <w:tcW w:type="dxa" w:w="680"/>
           </w:tcPr>
           <w:p>
             <w:r/>
@@ -2838,7 +2722,7 @@
         </w:tc>
         <w:tc>
           <w:tcPr>
-            <w:tcW w:type="dxa" w:w="1417"/>
+            <w:tcW w:type="dxa" w:w="1247"/>
           </w:tcPr>
           <w:p>
             <w:r/>
@@ -2852,7 +2736,7 @@
         </w:tc>
         <w:tc>
           <w:tcPr>
-            <w:tcW w:type="dxa" w:w="1984"/>
+            <w:tcW w:type="dxa" w:w="2494"/>
           </w:tcPr>
           <w:p>
             <w:r/>
@@ -2860,13 +2744,13 @@
               <w:rPr>
                 <w:sz w:val="20"/>
               </w:rPr>
-              <w:t>3.56</w:t>
+              <w:t>3.55</w:t>
             </w:r>
           </w:p>
         </w:tc>
         <w:tc>
           <w:tcPr>
-            <w:tcW w:type="dxa" w:w="1984"/>
+            <w:tcW w:type="dxa" w:w="2608"/>
           </w:tcPr>
           <w:p>
             <w:r/>
@@ -2874,13 +2758,13 @@
               <w:rPr>
                 <w:sz w:val="20"/>
               </w:rPr>
-              <w:t>3.33</w:t>
+              <w:t>3.30</w:t>
             </w:r>
           </w:p>
         </w:tc>
         <w:tc>
           <w:tcPr>
-            <w:tcW w:type="dxa" w:w="1417"/>
+            <w:tcW w:type="dxa" w:w="1247"/>
           </w:tcPr>
           <w:p>
             <w:r/>
@@ -2896,7 +2780,7 @@
       <w:tr>
         <w:tc>
           <w:tcPr>
-            <w:tcW w:type="dxa" w:w="850"/>
+            <w:tcW w:type="dxa" w:w="680"/>
           </w:tcPr>
           <w:p>
             <w:r/>
@@ -2910,7 +2794,7 @@
         </w:tc>
         <w:tc>
           <w:tcPr>
-            <w:tcW w:type="dxa" w:w="1417"/>
+            <w:tcW w:type="dxa" w:w="1247"/>
           </w:tcPr>
           <w:p>
             <w:r/>
@@ -2924,7 +2808,7 @@
         </w:tc>
         <w:tc>
           <w:tcPr>
-            <w:tcW w:type="dxa" w:w="1984"/>
+            <w:tcW w:type="dxa" w:w="2494"/>
           </w:tcPr>
           <w:p>
             <w:r/>
@@ -2932,13 +2816,13 @@
               <w:rPr>
                 <w:sz w:val="20"/>
               </w:rPr>
-              <w:t>3.43</w:t>
+              <w:t>3.42</w:t>
             </w:r>
           </w:p>
         </w:tc>
         <w:tc>
           <w:tcPr>
-            <w:tcW w:type="dxa" w:w="1984"/>
+            <w:tcW w:type="dxa" w:w="2608"/>
           </w:tcPr>
           <w:p>
             <w:r/>
@@ -2946,13 +2830,13 @@
               <w:rPr>
                 <w:sz w:val="20"/>
               </w:rPr>
-              <w:t>3.20</w:t>
+              <w:t>3.17</w:t>
             </w:r>
           </w:p>
         </w:tc>
         <w:tc>
           <w:tcPr>
-            <w:tcW w:type="dxa" w:w="1417"/>
+            <w:tcW w:type="dxa" w:w="1247"/>
           </w:tcPr>
           <w:p>
             <w:r/>
@@ -2961,6 +2845,201 @@
                 <w:sz w:val="20"/>
               </w:rPr>
               <w:t>19.8</w:t>
+            </w:r>
+          </w:p>
+        </w:tc>
+      </w:tr>
+    </w:tbl>
+    <w:p>
+      <w:pPr>
+        <w:spacing w:after="40"/>
+      </w:pPr>
+    </w:p>
+    <w:tbl>
+      <w:tblPr>
+        <w:tblStyle w:val="TableGrid"/>
+        <w:tblW w:type="auto" w:w="0"/>
+        <w:jc w:val="center"/>
+        <w:tblLook w:firstColumn="1" w:firstRow="1" w:lastColumn="0" w:lastRow="0" w:noHBand="0" w:noVBand="1" w:val="04A0"/>
+      </w:tblPr>
+      <w:tblGrid>
+        <w:gridCol w:w="4873"/>
+        <w:gridCol w:w="4873"/>
+      </w:tblGrid>
+      <w:tr>
+        <w:tc>
+          <w:tcPr>
+            <w:tcW w:type="dxa" w:w="2268"/>
+          </w:tcPr>
+          <w:p>
+            <w:r/>
+            <w:r>
+              <w:rPr>
+                <w:sz w:val="20"/>
+              </w:rPr>
+            </w:r>
+          </w:p>
+        </w:tc>
+        <w:tc>
+          <w:tcPr>
+            <w:tcW w:type="dxa" w:w="7143"/>
+          </w:tcPr>
+          <w:p>
+            <w:r/>
+            <w:r>
+              <w:rPr>
+                <w:sz w:val="20"/>
+              </w:rPr>
+            </w:r>
+          </w:p>
+        </w:tc>
+      </w:tr>
+      <w:tr>
+        <w:tc>
+          <w:tcPr>
+            <w:tcW w:type="dxa" w:w="2268"/>
+          </w:tcPr>
+          <w:p>
+            <w:r/>
+            <w:r>
+              <w:rPr>
+                <w:sz w:val="20"/>
+              </w:rPr>
+              <w:t>B3  freeboard</w:t>
+            </w:r>
+          </w:p>
+        </w:tc>
+        <w:tc>
+          <w:tcPr>
+            <w:tcW w:type="dxa" w:w="7143"/>
+          </w:tcPr>
+          <w:p>
+            <w:r/>
+            <w:r>
+              <w:rPr>
+                <w:sz w:val="20"/>
+              </w:rPr>
+              <w:t>Crest above datum = 24.9 + z_max: 30.4 m for d = 0 and 28.1 m for d = 9, against a freeboard line at 32.0 m, so every digit's shaft holds the first upsurge, d = 0 with 1.6 m to spare. The crest may stand at most 7.1 m above the reservoir; u₀·√(L·D_h/(g·D_s)) − z₀ ≤ 7.1 gives D_s ≥ 1.46 m, i.e. 1.5 m to 0.1 m, which is where the app's slider stops (the full crest equation puts the limit at 1.51 m). Shafts narrower than about 2.5 m throttle themselves in the app and rise less than the formula says.</w:t>
+            </w:r>
+          </w:p>
+        </w:tc>
+      </w:tr>
+      <w:tr>
+        <w:tc>
+          <w:tcPr>
+            <w:tcW w:type="dxa" w:w="2268"/>
+          </w:tcPr>
+          <w:p>
+            <w:r/>
+            <w:r>
+              <w:rPr>
+                <w:sz w:val="20"/>
+              </w:rPr>
+              <w:t>B4  the knee moved</w:t>
+            </w:r>
+          </w:p>
+        </w:tc>
+        <w:tc>
+          <w:tcPr>
+            <w:tcW w:type="dxa" w:w="7143"/>
+          </w:tcPr>
+          <w:p>
+            <w:r/>
+            <w:r>
+              <w:rPr>
+                <w:sz w:val="20"/>
+              </w:rPr>
+              <w:t>Both z_max and T scale as √L: × √(30/42.4) = 0.84. For d = 0 the frictionless crest would be 4.81 m and T 9.9 s.</w:t>
+            </w:r>
+          </w:p>
+        </w:tc>
+      </w:tr>
+      <w:tr>
+        <w:tc>
+          <w:tcPr>
+            <w:tcW w:type="dxa" w:w="2268"/>
+          </w:tcPr>
+          <w:p>
+            <w:r/>
+            <w:r>
+              <w:rPr>
+                <w:sz w:val="20"/>
+              </w:rPr>
+              <w:t>C1</w:t>
+            </w:r>
+          </w:p>
+        </w:tc>
+        <w:tc>
+          <w:tcPr>
+            <w:tcW w:type="dxa" w:w="7143"/>
+          </w:tcPr>
+          <w:p>
+            <w:r/>
+            <w:r>
+              <w:rPr>
+                <w:sz w:val="20"/>
+              </w:rPr>
+              <w:t>P = ρ·g·q·(H − k_t·q²); dP/dq = ρ·g·(H − 3·k_t·q²) = 0 ⇒ k_t·q² = H/3 = h_f.</w:t>
+            </w:r>
+          </w:p>
+        </w:tc>
+      </w:tr>
+      <w:tr>
+        <w:tc>
+          <w:tcPr>
+            <w:tcW w:type="dxa" w:w="2268"/>
+          </w:tcPr>
+          <w:p>
+            <w:r/>
+            <w:r>
+              <w:rPr>
+                <w:sz w:val="20"/>
+              </w:rPr>
+              <w:t>C2  design point</w:t>
+            </w:r>
+          </w:p>
+        </w:tc>
+        <w:tc>
+          <w:tcPr>
+            <w:tcW w:type="dxa" w:w="7143"/>
+          </w:tcPr>
+          <w:p>
+            <w:r/>
+            <w:r>
+              <w:rPr>
+                <w:sz w:val="20"/>
+              </w:rPr>
+              <w:t>k_t = 0.00114 (headrace) + 0.00111 (penstock) = 0.00225 s²/m³; h_f = k_t·q₀² = 0.13 m, 0.6% of H = 21.9 m. u_jet = √(2g × 21.77) = 20.7 m/s (the app reads about 20.6 m/s). P = ρ·g·q₀·(H − h_f) = 1.62 MW per metre of width, and ½·ρ·q₀·u_jet² = 1.62 MW.</w:t>
+            </w:r>
+          </w:p>
+        </w:tc>
+      </w:tr>
+      <w:tr>
+        <w:tc>
+          <w:tcPr>
+            <w:tcW w:type="dxa" w:w="2268"/>
+          </w:tcPr>
+          <w:p>
+            <w:r/>
+            <w:r>
+              <w:rPr>
+                <w:sz w:val="20"/>
+              </w:rPr>
+              <w:t>C3  the peak</w:t>
+            </w:r>
+          </w:p>
+        </w:tc>
+        <w:tc>
+          <w:tcPr>
+            <w:tcW w:type="dxa" w:w="7143"/>
+          </w:tcPr>
+          <w:p>
+            <w:r/>
+            <w:r>
+              <w:rPr>
+                <w:sz w:val="20"/>
+              </w:rPr>
+              <w:t>q* = √(H/(3·k_t)) = 57.0 m²/s; u_jet = √(2g·2H/3) = 16.9 m/s; opening q*/u_jet = 3.37 m, 1.4 times the penstock bore and 2.8 times the top of the Nozzle gap slider. The peak is unreachable on this scheme. At the slider's top (1.2 m, about 18 m²/s) h_f = 0.73 m, 3.3% of the head, so the jet stays within 1.7% of √(2gH) = 20.7 m/s all the way up the slider and the power keeps rising with the gap.</w:t>
             </w:r>
           </w:p>
         </w:tc>
@@ -2980,7 +3059,7 @@
           <w:b w:val="0"/>
           <w:i/>
         </w:rPr>
-        <w:t>What the app measures (dry run, Medium resolution): crests 0.91–0.98 of the frictionless value and within ±5% of the with-friction column; periods 17–26% longer than 2π√(L·D_s/(g·D_h)) because the shaft's own water has inertia the formula leaves out.</w:t>
+        <w:t>What the app measured (dry run, Medium resolution), crests above the reservoir for d = 0…9: 5.16, 4.79, 4.67, 4.18, 3.99, 3.79, 3.70, 3.58, 3.27, 3.22 m; periods: 14.9, 16.2, 17.6, 19.1, 18.9, 19.8, 21.2, 21.0, 22.2, 23.7 s. The crests are 0.90–0.97 of the frictionless value and the periods 15–28% over 2π·√(L·D_s/(g·D_h)), because the shaft's own water has inertia the formula leaves out.</w:t>
       </w:r>
     </w:p>
     <w:sectPr>

</xml_diff>

<commit_message>
HP-3: the tutorial sheet is set on the scene itself, and ships its generator
Every question on the sheet now uses the hydraulician scheme the class runs
— its 42.4 m headrace, 3.05 m bore, 7.6 m²/s, Darcy f = 0.03, the student's
own shaft width, the 20 m penstock and the 0.48 m nozzle — so every answer
can be checked on screen: the steady drawdown (0.38 m predicted, 0.35 read),
the crest and period per digit, whether the shaft clears the 35 m roof, the
jet speed (20.7 predicted, 20.6 read) and why the h_f = H/3 peak cannot be
reached on this scheme (it would need a nozzle wider than the penstock).
The real-scheme problem is gone. tutorial-sheet.py regenerates the .docx,
answers appendix included, from the same constants. Word's lock files are
ignored.

Co-Authored-By: Claude Fable 5.1 <noreply@anthropic.com>
</commit_message>
<xml_diff>
--- a/exercises/HP-3-surge-tower/tutorial-sheet.docx
+++ b/exercises/HP-3-surge-tower/tutorial-sheet.docx
@@ -24,7 +24,7 @@
           <w:b w:val="0"/>
           <w:i/>
         </w:rPr>
-        <w:t>Complete by hand before the hydraulician session (exercise HP-3, Design the surge tower). Everything on this sheet is the scheme you will run, and every number can be checked on screen.</w:t>
+        <w:t>Complete by hand before the hydraulician session (exercise HP-3, Design the surge tower). Everything on this sheet is the scheme you will run in class, and every number on it can be checked on screen.</w:t>
       </w:r>
     </w:p>
     <w:p>
@@ -42,7 +42,7 @@
       <w:r>
         <w:drawing>
           <wp:inline xmlns:a="http://schemas.openxmlformats.org/drawingml/2006/main" xmlns:pic="http://schemas.openxmlformats.org/drawingml/2006/picture">
-            <wp:extent cx="5400000" cy="2908374"/>
+            <wp:extent cx="5400000" cy="2828571"/>
             <wp:docPr id="1" name="Picture 1"/>
             <wp:cNvGraphicFramePr>
               <a:graphicFrameLocks noChangeAspect="1"/>
@@ -51,7 +51,7 @@
               <a:graphicData uri="http://schemas.openxmlformats.org/drawingml/2006/picture">
                 <pic:pic>
                   <pic:nvPicPr>
-                    <pic:cNvPr id="0" name="scheme-model.png"/>
+                    <pic:cNvPr id="0" name="hp3-scheme-model.png"/>
                     <pic:cNvPicPr/>
                   </pic:nvPicPr>
                   <pic:blipFill>
@@ -63,7 +63,7 @@
                   <pic:spPr>
                     <a:xfrm>
                       <a:off x="0" y="0"/>
-                      <a:ext cx="5400000" cy="2908374"/>
+                      <a:ext cx="5400000" cy="2828571"/>
                     </a:xfrm>
                     <a:prstGeom prst="rect"/>
                   </pic:spPr>
@@ -83,7 +83,7 @@
           <w:b w:val="0"/>
           <w:i w:val="0"/>
         </w:rPr>
-        <w:t>The scheme is the one the app holds for exercise HP-3 (figure, in true proportion, drawn with a 3 m shaft). The model is a vertical slice one metre wide, so discharges are per metre of width and the areas in the formulas are heights: A/A_s = D_h/D_s. The datum is the domain floor. A level headrace runs from the reservoir to a knee, where an open surge shaft rises off it; from the knee a penstock drops to a level tailpipe and a nozzle that discharges to the air.</w:t>
+        <w:t>A reservoir feeds a level headrace tunnel; at the knee a surge shaft rises off the tunnel, open to the air, and a penstock drops to a nozzle at the power house. The model is a vertical slice one metre wide: discharges are per metre of width and an "area" is a height, so A/A_s = D_h/D_s. Heights are above the datum, the floor of the picture.</w:t>
       </w:r>
     </w:p>
     <w:tbl>
@@ -100,7 +100,7 @@
       <w:tr>
         <w:tc>
           <w:tcPr>
-            <w:tcW w:type="dxa" w:w="1814"/>
+            <w:tcW w:type="dxa" w:w="1928"/>
           </w:tcPr>
           <w:p>
             <w:r/>
@@ -115,7 +115,7 @@
         </w:tc>
         <w:tc>
           <w:tcPr>
-            <w:tcW w:type="dxa" w:w="7597"/>
+            <w:tcW w:type="dxa" w:w="7143"/>
           </w:tcPr>
           <w:p>
             <w:r/>
@@ -132,7 +132,7 @@
       <w:tr>
         <w:tc>
           <w:tcPr>
-            <w:tcW w:type="dxa" w:w="1814"/>
+            <w:tcW w:type="dxa" w:w="1928"/>
           </w:tcPr>
           <w:p>
             <w:r/>
@@ -140,13 +140,13 @@
               <w:rPr>
                 <w:sz w:val="20"/>
               </w:rPr>
-              <w:t>reservoir</w:t>
+              <w:t>reservoir level</w:t>
             </w:r>
           </w:p>
         </w:tc>
         <w:tc>
           <w:tcPr>
-            <w:tcW w:type="dxa" w:w="7597"/>
+            <w:tcW w:type="dxa" w:w="7143"/>
           </w:tcPr>
           <w:p>
             <w:r/>
@@ -154,7 +154,7 @@
               <w:rPr>
                 <w:sz w:val="20"/>
               </w:rPr>
-              <w:t>level 24.9 m above datum (the slider says 25.0; a gauge by the wall reads 24.9)</w:t>
+              <w:t>24.9 m (the slider says 25.0; a gauge by the wall reads 24.9)</w:t>
             </w:r>
           </w:p>
         </w:tc>
@@ -162,7 +162,7 @@
       <w:tr>
         <w:tc>
           <w:tcPr>
-            <w:tcW w:type="dxa" w:w="1814"/>
+            <w:tcW w:type="dxa" w:w="1928"/>
           </w:tcPr>
           <w:p>
             <w:r/>
@@ -176,7 +176,7 @@
         </w:tc>
         <w:tc>
           <w:tcPr>
-            <w:tcW w:type="dxa" w:w="7597"/>
+            <w:tcW w:type="dxa" w:w="7143"/>
           </w:tcPr>
           <w:p>
             <w:r/>
@@ -184,7 +184,7 @@
               <w:rPr>
                 <w:sz w:val="20"/>
               </w:rPr>
-              <w:t>level; invert at 12.5 m; bore D_h = 3.05 m; length L = 42.4 m from the reservoir wall (x = 7.65 m) to the centre of the surge shaft (x = 50 m)</w:t>
+              <w:t>level; invert 12.5 m; bore D_h = 3.05 m; length L = 42.4 m from the reservoir wall (x = 7.65 m) to the shaft centre (x = 50 m)</w:t>
             </w:r>
           </w:p>
         </w:tc>
@@ -192,7 +192,7 @@
       <w:tr>
         <w:tc>
           <w:tcPr>
-            <w:tcW w:type="dxa" w:w="1814"/>
+            <w:tcW w:type="dxa" w:w="1928"/>
           </w:tcPr>
           <w:p>
             <w:r/>
@@ -206,7 +206,7 @@
         </w:tc>
         <w:tc>
           <w:tcPr>
-            <w:tcW w:type="dxa" w:w="7597"/>
+            <w:tcW w:type="dxa" w:w="7143"/>
           </w:tcPr>
           <w:p>
             <w:r/>
@@ -214,7 +214,7 @@
               <w:rPr>
                 <w:sz w:val="20"/>
               </w:rPr>
-              <w:t>width D_s = 2.5 + 0.5·d metres, d the last digit of your student number; open to the air; rises off the headrace at the knee, x = 50 m. The domain roof is at 35 m.</w:t>
+              <w:t>width D_s = 2.5 + 0.5·d m, d the last digit of your student number; open to the air; the roof of the domain is at 35 m</w:t>
             </w:r>
           </w:p>
         </w:tc>
@@ -222,7 +222,7 @@
       <w:tr>
         <w:tc>
           <w:tcPr>
-            <w:tcW w:type="dxa" w:w="1814"/>
+            <w:tcW w:type="dxa" w:w="1928"/>
           </w:tcPr>
           <w:p>
             <w:r/>
@@ -236,7 +236,7 @@
         </w:tc>
         <w:tc>
           <w:tcPr>
-            <w:tcW w:type="dxa" w:w="7597"/>
+            <w:tcW w:type="dxa" w:w="7143"/>
           </w:tcPr>
           <w:p>
             <w:r/>
@@ -244,7 +244,7 @@
               <w:rPr>
                 <w:sz w:val="20"/>
               </w:rPr>
-              <w:t>bore D_p = 2.4 m; 14.9 m from the knee at (x, z) = (50, 14) down to (60, 3), then a 5 m level tailpipe to the nozzle at x = 65 m: L_p ≈ 20 m in all</w:t>
+              <w:t>bore D_p = 2.4 m; 14.9 m from the knee at (50, 14) down to (60, 3), then a 5 m level tailpipe to the nozzle at x = 65 m: L_p ≈ 20 m</w:t>
             </w:r>
           </w:p>
         </w:tc>
@@ -252,7 +252,7 @@
       <w:tr>
         <w:tc>
           <w:tcPr>
-            <w:tcW w:type="dxa" w:w="1814"/>
+            <w:tcW w:type="dxa" w:w="1928"/>
           </w:tcPr>
           <w:p>
             <w:r/>
@@ -266,7 +266,7 @@
         </w:tc>
         <w:tc>
           <w:tcPr>
-            <w:tcW w:type="dxa" w:w="7597"/>
+            <w:tcW w:type="dxa" w:w="7143"/>
           </w:tcPr>
           <w:p>
             <w:r/>
@@ -274,7 +274,7 @@
               <w:rPr>
                 <w:sz w:val="20"/>
               </w:rPr>
-              <w:t>opening 0.48 m centred on the tailpipe axis at z = 3.0 m, discharging to atmosphere. The valve at x = 63.5 m, just upstream of it, is the turbine's instantaneous shutdown (the V key).</w:t>
+              <w:t>opening 0.48 m centred on the tailpipe axis at z = 3.0 m, discharging to atmosphere; the valve at x = 63.5 m is the turbine's instantaneous shutdown (the V key)</w:t>
             </w:r>
           </w:p>
         </w:tc>
@@ -282,7 +282,7 @@
       <w:tr>
         <w:tc>
           <w:tcPr>
-            <w:tcW w:type="dxa" w:w="1814"/>
+            <w:tcW w:type="dxa" w:w="1928"/>
           </w:tcPr>
           <w:p>
             <w:r/>
@@ -296,7 +296,7 @@
         </w:tc>
         <w:tc>
           <w:tcPr>
-            <w:tcW w:type="dxa" w:w="7597"/>
+            <w:tcW w:type="dxa" w:w="7143"/>
           </w:tcPr>
           <w:p>
             <w:r/>
@@ -312,7 +312,7 @@
       <w:tr>
         <w:tc>
           <w:tcPr>
-            <w:tcW w:type="dxa" w:w="1814"/>
+            <w:tcW w:type="dxa" w:w="1928"/>
           </w:tcPr>
           <w:p>
             <w:r/>
@@ -326,7 +326,7 @@
         </w:tc>
         <w:tc>
           <w:tcPr>
-            <w:tcW w:type="dxa" w:w="7597"/>
+            <w:tcW w:type="dxa" w:w="7143"/>
           </w:tcPr>
           <w:p>
             <w:r/>
@@ -334,7 +334,7 @@
               <w:rPr>
                 <w:sz w:val="20"/>
               </w:rPr>
-              <w:t>Darcy f = 0.03, measured in the app with two gauges 22 m apart on the headrace axis (the optional part of the exercise repeats that measurement). For a slot one metre wide the hydraulic diameter is D_H = 2D (R_h = D/2), so h_f = f·(L/D_H)·u²/(2g).</w:t>
+              <w:t>Darcy f = 0.03, measured in the app with two gauges 22 m apart on the headrace axis. For a slot one metre wide the hydraulic diameter is D_H = 2D (R_h = D/2), so h_f = f·(L/D_H)·u²/2g</w:t>
             </w:r>
           </w:p>
         </w:tc>
@@ -342,7 +342,7 @@
       <w:tr>
         <w:tc>
           <w:tcPr>
-            <w:tcW w:type="dxa" w:w="1814"/>
+            <w:tcW w:type="dxa" w:w="1928"/>
           </w:tcPr>
           <w:p>
             <w:r/>
@@ -350,13 +350,13 @@
               <w:rPr>
                 <w:sz w:val="20"/>
               </w:rPr>
-              <w:t>g, ρ</w:t>
+              <w:t>constants</w:t>
             </w:r>
           </w:p>
         </w:tc>
         <w:tc>
           <w:tcPr>
-            <w:tcW w:type="dxa" w:w="7597"/>
+            <w:tcW w:type="dxa" w:w="7143"/>
           </w:tcPr>
           <w:p>
             <w:r/>
@@ -364,7 +364,7 @@
               <w:rPr>
                 <w:sz w:val="20"/>
               </w:rPr>
-              <w:t>9.81 m/s², 1000 kg/m³</w:t>
+              <w:t>g = 9.81 m/s², ρ = 1000 kg/m³</w:t>
             </w:r>
           </w:p>
         </w:tc>
@@ -392,7 +392,7 @@
           <w:b w:val="0"/>
           <w:i w:val="0"/>
         </w:rPr>
-        <w:t>z is the shaft water level measured DOWN from the reservoir level (positive below it); z₀ is the steady level and z_max the crest above the reservoir. u is the headrace velocity, L and A the headrace length and area (A = D_h), A_s the shaft area (A_s = D_s), k the lumped loss coefficient in z₀ = k·u₀², and Z = L·A/(2·g·k·A_s). This is the app's notation (docs/notation.md); the worked example the class has seen writes y for z.</w:t>
+        <w:t>z is the water level in the shaft measured DOWN from the reservoir level (positive below it): z₀ is the steady running level and z_max the crest of the upsurge above the reservoir. u is the headrace velocity, L and A its length and "area" (= D_h), A_s the shaft "area" (= D_s), k the lumped loss coefficient in z₀ = k·u², and Z = L·A/(2·g·k·A_s). This is the app's notation (docs/notation.md); the worked example you have seen writes y for z.</w:t>
       </w:r>
     </w:p>
     <w:p>
@@ -400,26 +400,22 @@
         <w:pStyle w:val="Heading1"/>
       </w:pPr>
       <w:r>
-        <w:t>Part A — Steady running (predict, then read on screen)</w:t>
+        <w:t>Part A — Steady running (predict, then read it on screen)</w:t>
       </w:r>
     </w:p>
     <w:p>
       <w:pPr>
-        <w:tabs>
-          <w:tab w:pos="567" w:val="left"/>
-        </w:tabs>
+        <w:pStyle w:val="ListNumber"/>
         <w:spacing w:after="80"/>
-        <w:ind w:left="567" w:hanging="567"/>
       </w:pPr>
       <w:r>
         <w:rPr>
           <w:b/>
         </w:rPr>
         <w:t>A1.</w:t>
-        <w:tab/>
       </w:r>
       <w:r>
-        <w:t>Find the headrace velocity, u₀ = q₀/D_h.</w:t>
+        <w:t xml:space="preserve"> The velocity in the headrace, u₀ = q₀/D_h.</w:t>
       </w:r>
     </w:p>
     <w:p>
@@ -445,21 +441,17 @@
     </w:p>
     <w:p>
       <w:pPr>
-        <w:tabs>
-          <w:tab w:pos="567" w:val="left"/>
-        </w:tabs>
+        <w:pStyle w:val="ListNumber"/>
         <w:spacing w:after="80"/>
-        <w:ind w:left="567" w:hanging="567"/>
       </w:pPr>
       <w:r>
         <w:rPr>
           <w:b/>
         </w:rPr>
         <w:t>A2.</w:t>
-        <w:tab/>
       </w:r>
       <w:r>
-        <w:t>Find the friction loss along the headrace, with D_H = 2·D_h.</w:t>
+        <w:t xml:space="preserve"> The friction loss along the headrace.</w:t>
       </w:r>
     </w:p>
     <w:p>
@@ -472,7 +464,7 @@
           <w:rFonts w:ascii="Cambria Math" w:hAnsi="Cambria Math" w:eastAsia="Cambria Math"/>
           <w:sz w:val="23"/>
         </w:rPr>
-        <w:t>h_f = f · (L/D_H) · u₀² / (2g)</w:t>
+        <w:t>h_f = f · (L/D_H) · u₀² / (2g),        D_H = 2·D_h</w:t>
       </w:r>
     </w:p>
     <w:p>
@@ -498,21 +490,17 @@
     </w:p>
     <w:p>
       <w:pPr>
-        <w:tabs>
-          <w:tab w:pos="567" w:val="left"/>
-        </w:tabs>
+        <w:pStyle w:val="ListNumber"/>
         <w:spacing w:after="80"/>
-        <w:ind w:left="567" w:hanging="567"/>
       </w:pPr>
       <w:r>
         <w:rPr>
           <w:b/>
         </w:rPr>
         <w:t>A3.</w:t>
-        <w:tab/>
       </w:r>
       <w:r>
-        <w:t>The shaft is open to the air and carries no flow: it is a piezometer at the knee and reads the hydraulic grade line there. How far below the reservoir does its water stand? Take the entry loss as negligible, so the drawdown is the velocity head u₀²/2g plus h_f. The app's gauges read about 0.35 m; explain why your prediction lies within the wobble of that reading.</w:t>
+        <w:t xml:space="preserve"> The shaft is open to the air and carries no flow, so it is a piezometer at the knee: it reads the hydraulic grade line there. How far below the reservoir does its water stand? (Velocity head u₀²/2g plus h_f; take the entry loss as negligible.) The app's gauges read about 0.35 m, wobbling ±0.05 m. Is your prediction inside that?</w:t>
       </w:r>
     </w:p>
     <w:p>
@@ -546,21 +534,17 @@
     </w:p>
     <w:p>
       <w:pPr>
-        <w:tabs>
-          <w:tab w:pos="567" w:val="left"/>
-        </w:tabs>
+        <w:pStyle w:val="ListNumber"/>
         <w:spacing w:after="80"/>
-        <w:ind w:left="567" w:hanging="567"/>
       </w:pPr>
       <w:r>
         <w:rPr>
           <w:b/>
         </w:rPr>
         <w:t>A4.</w:t>
-        <w:tab/>
       </w:r>
       <w:r>
-        <w:t>Write the whole drawdown as z₀ = k·u₀² and find k (s²/m). Keep it: the surge calculation uses k, not f.</w:t>
+        <w:t xml:space="preserve"> Write the whole drawdown as z₀ = k·u₀² and find k (s²/m). Keep it: the surge uses k, not f.</w:t>
       </w:r>
     </w:p>
     <w:p>
@@ -601,7 +585,7 @@
           <w:b w:val="0"/>
           <w:i w:val="0"/>
         </w:rPr>
-        <w:t>Rigid column: the water in the headrace is one incompressible slug of length L. When the valve slams, the slug decelerates against the head it builds up in the shaft. With the level z measured down from the reservoir:</w:t>
+        <w:t>Rigid column: the water in the headrace is one incompressible slug of length L. When the valve shuts it decelerates against the head it builds in the shaft. With z measured down from the reservoir:</w:t>
       </w:r>
     </w:p>
     <w:p>
@@ -619,21 +603,17 @@
     </w:p>
     <w:p>
       <w:pPr>
-        <w:tabs>
-          <w:tab w:pos="567" w:val="left"/>
-        </w:tabs>
+        <w:pStyle w:val="ListNumber"/>
         <w:spacing w:after="80"/>
-        <w:ind w:left="567" w:hanging="567"/>
       </w:pPr>
       <w:r>
         <w:rPr>
           <w:b/>
         </w:rPr>
         <w:t>B1.</w:t>
-        <w:tab/>
       </w:r>
       <w:r>
-        <w:t>Ignore friction. Eliminate t between the two equations (or write the energy balance) and show that the column comes to rest when the shaft has risen z_max = u₀·√(L·A/(g·A_s)) above the reservoir, and that the oscillation has period T = 2π·√(L·A_s/(g·A)). Evaluate both for your D_s.</w:t>
+        <w:t xml:space="preserve"> Ignore friction. Eliminate t between the two equations (or write the energy balance) and show that the column comes to rest when the shaft has risen z_max = u₀·√(L·A/(g·A_s)) above the reservoir, with period T = 2π·√(L·A_s/(g·A)). Evaluate both for YOUR shaft width.</w:t>
       </w:r>
     </w:p>
     <w:p>
@@ -683,21 +663,17 @@
     </w:p>
     <w:p>
       <w:pPr>
-        <w:tabs>
-          <w:tab w:pos="567" w:val="left"/>
-        </w:tabs>
+        <w:pStyle w:val="ListNumber"/>
         <w:spacing w:after="80"/>
-        <w:ind w:left="567" w:hanging="567"/>
       </w:pPr>
       <w:r>
         <w:rPr>
           <w:b/>
         </w:rPr>
         <w:t>B2.</w:t>
-        <w:tab/>
       </w:r>
       <w:r>
-        <w:t>Now keep friction. Dividing the two equations gives a linear equation in u² whose solution is</w:t>
+        <w:t xml:space="preserve"> Keep friction. Dividing the two equations gives a linear equation in u² whose solution is</w:t>
       </w:r>
     </w:p>
     <w:p>
@@ -722,7 +698,7 @@
           <w:b w:val="0"/>
           <w:i w:val="0"/>
         </w:rPr>
-        <w:t>C is fixed by the steady state (u = u₀ at z = z₀ = k·u₀²): C = −(Z/k)·e^(−z₀/Z). The crest is where u = 0. Evaluate Z and C for your D_s, then find the crest by trial on</w:t>
+        <w:t>C is fixed by the steady state (u = u₀ at z = z₀ = k·u₀²): C = −(Z/k)·e^(−z₀/Z). The crest is where u = 0. Evaluate Z and C for your shaft, then find the crest by trial and error on</w:t>
       </w:r>
     </w:p>
     <w:p>
@@ -747,7 +723,7 @@
           <w:b w:val="0"/>
           <w:i w:val="0"/>
         </w:rPr>
-        <w:t>(z is negative above the reservoir; start the trials near −z_max from B1 and work upward). Tabulate three or four trials. z₀/Z is small here, so the crest lands within about 0.13 m of z_max − z₀, a little above it; do the trial anyway and see.</w:t>
+        <w:t>(z is negative above the reservoir; start near −z_max from B1 and work upward). z₀/Z is small here, so the crest lands within a few centimetres of z_max − z₀: the shaft starts z₀ below the reservoir and rises by about the frictionless amount. Do the trial anyway and see it happen.</w:t>
       </w:r>
     </w:p>
     <w:tbl>
@@ -1070,21 +1046,17 @@
     </w:p>
     <w:p>
       <w:pPr>
-        <w:tabs>
-          <w:tab w:pos="567" w:val="left"/>
-        </w:tabs>
+        <w:pStyle w:val="ListNumber"/>
         <w:spacing w:after="80"/>
-        <w:ind w:left="567" w:hanging="567"/>
       </w:pPr>
       <w:r>
         <w:rPr>
           <w:b/>
         </w:rPr>
         <w:t>B3.</w:t>
-        <w:tab/>
       </w:r>
       <w:r>
-        <w:t>The crest's elevation above datum is 24.9 + z_max. Does your shaft hold the first upsurge with 3 m of freeboard under the 35 m roof? What is the narrowest shaft, to 0.1 m, that would? (Use the with-friction crest ≈ u₀·√(L·D_h/(g·D_s)) − z₀.)</w:t>
+        <w:t xml:space="preserve"> The crest stands at 24.9 + z_max above datum. Does your shaft hold the first upsurge with 3 m of freeboard under the 35 m roof? What is the narrowest shaft, to 0.1 m, that would?</w:t>
       </w:r>
     </w:p>
     <w:p>
@@ -1118,21 +1090,17 @@
     </w:p>
     <w:p>
       <w:pPr>
-        <w:tabs>
-          <w:tab w:pos="567" w:val="left"/>
-        </w:tabs>
+        <w:pStyle w:val="ListNumber"/>
         <w:spacing w:after="80"/>
-        <w:ind w:left="567" w:hanging="567"/>
       </w:pPr>
       <w:r>
         <w:rPr>
           <w:b/>
         </w:rPr>
         <w:t>B4.</w:t>
-        <w:tab/>
       </w:r>
       <w:r>
-        <w:t>The Knee x slider moves the shaft. If L were 30 m instead of 42.4 m, by what factor would z_max and T change?</w:t>
+        <w:t xml:space="preserve"> The Knee x slider moves the shaft along the tunnel. If L were 30 m instead of 42.4 m, by what factor would z_max and T change?</w:t>
       </w:r>
     </w:p>
     <w:p>
@@ -1173,7 +1141,7 @@
           <w:b w:val="0"/>
           <w:i w:val="0"/>
         </w:rPr>
-        <w:t>The power in the jet is the discharge times the head left after friction in the headrace and the penstock together, per metre of width. H is the reservoir level above the nozzle axis, H = 24.9 − 3.0 = 21.9 m, and h_f = k_t·q² is the friction in both:</w:t>
+        <w:t>The power delivered to the nozzle, per metre of width, is the discharge times the head left after friction in the headrace and the penstock together:</w:t>
       </w:r>
     </w:p>
     <w:p>
@@ -1186,7 +1154,7 @@
           <w:rFonts w:ascii="Cambria Math" w:hAnsi="Cambria Math" w:eastAsia="Cambria Math"/>
           <w:sz w:val="23"/>
         </w:rPr>
-        <w:t>P = ρ·g·q·(H − h_f)            h_f = k_t·q²</w:t>
+        <w:t>P = ρ·g·q·(H − h_f),      H = 24.9 − 3.0 m,      h_f = k_t·q²</w:t>
       </w:r>
     </w:p>
     <w:p>
@@ -1199,26 +1167,22 @@
           <w:rFonts w:ascii="Cambria Math" w:hAnsi="Cambria Math" w:eastAsia="Cambria Math"/>
           <w:sz w:val="23"/>
         </w:rPr>
-        <w:t>k_t = f·(L/D_Hh)/(2g·D_h²) + f·(L_p/D_Hp)/(2g·D_p²),      D_Hh = 2·D_h,   D_Hp = 2·D_p,   L_p = 20 m</w:t>
+        <w:t>k_t = f·(L/D_Hh) / (2g·D_h²)  +  f·(L_p/D_Hp) / (2g·D_p²)</w:t>
       </w:r>
     </w:p>
     <w:p>
       <w:pPr>
-        <w:tabs>
-          <w:tab w:pos="567" w:val="left"/>
-        </w:tabs>
+        <w:pStyle w:val="ListNumber"/>
         <w:spacing w:after="80"/>
-        <w:ind w:left="567" w:hanging="567"/>
       </w:pPr>
       <w:r>
         <w:rPr>
           <w:b/>
         </w:rPr>
         <w:t>C1.</w:t>
-        <w:tab/>
       </w:r>
       <w:r>
-        <w:t>Show that P is greatest when h_f = H/3, whatever k_t is (set dP/dq = 0).</w:t>
+        <w:t xml:space="preserve"> Show that P is greatest when h_f = H/3, whatever k_t is (set dP/dq = 0).</w:t>
       </w:r>
     </w:p>
     <w:p>
@@ -1252,22 +1216,26 @@
     </w:p>
     <w:p>
       <w:pPr>
-        <w:tabs>
-          <w:tab w:pos="567" w:val="left"/>
-        </w:tabs>
+        <w:pStyle w:val="ListNumber"/>
         <w:spacing w:after="80"/>
-        <w:ind w:left="567" w:hanging="567"/>
       </w:pPr>
       <w:r>
         <w:rPr>
           <w:b/>
         </w:rPr>
         <w:t>C2.</w:t>
-        <w:tab/>
       </w:r>
       <w:r>
-        <w:t>At the design point q₀: find h_f (headrace and penstock), the jet speed u_jet = √(2g·(H − h_f)) and the power P = ρ·g·q₀·(H − h_f), and check that it equals ½·ρ·q₀·u_jet². On screen: Field → Speed, then hover the jet just past the nozzle (the app reads about 20.6 m/s).</w:t>
+        <w:t xml:space="preserve"> At the design point q₀: the friction loss in headrace and penstock, the jet speed u_jet = √(2g·(H − h_f)) and the power, which is also ½·ρ·q₀·u_jet². On screen: Field → Speed, hover the jet just past the nozzle (the app reads about 20.6 m/s).</w:t>
       </w:r>
+    </w:p>
+    <w:p>
+      <w:pPr>
+        <w:spacing w:after="0"/>
+        <w:pBdr>
+          <w:bottom w:val="dotted" w:sz="4" w:space="1" w:color="A0A0A0"/>
+        </w:pBdr>
+      </w:pPr>
     </w:p>
     <w:p>
       <w:pPr>
@@ -1300,22 +1268,26 @@
     </w:p>
     <w:p>
       <w:pPr>
-        <w:tabs>
-          <w:tab w:pos="567" w:val="left"/>
-        </w:tabs>
+        <w:pStyle w:val="ListNumber"/>
         <w:spacing w:after="80"/>
-        <w:ind w:left="567" w:hanging="567"/>
       </w:pPr>
       <w:r>
         <w:rPr>
           <w:b/>
         </w:rPr>
         <w:t>C3.</w:t>
-        <w:tab/>
       </w:r>
       <w:r>
-        <w:t>Find the discharge q* = √(H/(3·k_t)) that would put a third of the head into friction, the jet speed at that point, √(2g·2H/3), and the nozzle opening it would need, q*/u_jet. Compare the opening with the penstock bore (2.4 m) and with the top of the Nozzle gap slider (1.2 m, about 18 m²/s). Where does the peak lie on this scheme, and what will the jet speed and the power do as you open the gap?</w:t>
+        <w:t xml:space="preserve"> The discharge q* = √(H/(3·k_t)) that would put a third of the head into friction, the jet speed at that point, √(2g·2H/3), and the nozzle opening it would need, q*/u_jet. Compare with the penstock bore (2.4 m) and with the top of the Nozzle gap slider (1.2 m, about 18 m²/s). Where does that leave the peak on this scheme?</w:t>
       </w:r>
+    </w:p>
+    <w:p>
+      <w:pPr>
+        <w:spacing w:after="0"/>
+        <w:pBdr>
+          <w:bottom w:val="dotted" w:sz="4" w:space="1" w:color="A0A0A0"/>
+        </w:pBdr>
+      </w:pPr>
     </w:p>
     <w:p>
       <w:pPr>
@@ -1356,40 +1328,32 @@
     </w:p>
     <w:p>
       <w:pPr>
-        <w:tabs>
-          <w:tab w:pos="567" w:val="left"/>
-        </w:tabs>
+        <w:pStyle w:val="ListNumber"/>
         <w:spacing w:after="80"/>
-        <w:ind w:left="567" w:hanging="567"/>
       </w:pPr>
       <w:r>
         <w:rPr>
           <w:b/>
         </w:rPr>
         <w:t>D1.</w:t>
-        <w:tab/>
       </w:r>
       <w:r>
-        <w:t>Fill the predicted column from Parts A–C for your digit.</w:t>
+        <w:t xml:space="preserve"> Fill the predicted column from Parts A–C for your own digit.</w:t>
       </w:r>
     </w:p>
     <w:p>
       <w:pPr>
-        <w:tabs>
-          <w:tab w:pos="567" w:val="left"/>
-        </w:tabs>
+        <w:pStyle w:val="ListNumber"/>
         <w:spacing w:after="80"/>
-        <w:ind w:left="567" w:hanging="567"/>
       </w:pPr>
       <w:r>
         <w:rPr>
           <w:b/>
         </w:rPr>
         <w:t>D2.</w:t>
-        <w:tab/>
       </w:r>
       <w:r>
-        <w:t>In the session, read u₀ (hover the headrace), z₀ (reservoir gauge minus shaft gauge), the rise of the shaft above its steady level after the slam, and T from the first crest to the second; z_max = rise − z₀. The class then pools every width into one curve.</w:t>
+        <w:t xml:space="preserve"> In the session read u₀ and z₀ before the slam, then the rise of the shaft above its steady level and the period T after it; z_max = rise − z₀. Compare with D1; the class then pools every width into one curve.</w:t>
       </w:r>
     </w:p>
     <w:tbl>
@@ -1407,7 +1371,7 @@
       <w:tr>
         <w:tc>
           <w:tcPr>
-            <w:tcW w:type="dxa" w:w="3742"/>
+            <w:tcW w:type="dxa" w:w="3515"/>
           </w:tcPr>
           <w:p>
             <w:r/>
@@ -1421,7 +1385,7 @@
         </w:tc>
         <w:tc>
           <w:tcPr>
-            <w:tcW w:type="dxa" w:w="2551"/>
+            <w:tcW w:type="dxa" w:w="2494"/>
           </w:tcPr>
           <w:p>
             <w:r/>
@@ -1436,7 +1400,7 @@
         </w:tc>
         <w:tc>
           <w:tcPr>
-            <w:tcW w:type="dxa" w:w="2551"/>
+            <w:tcW w:type="dxa" w:w="2494"/>
           </w:tcPr>
           <w:p>
             <w:r/>
@@ -1453,7 +1417,7 @@
       <w:tr>
         <w:tc>
           <w:tcPr>
-            <w:tcW w:type="dxa" w:w="3742"/>
+            <w:tcW w:type="dxa" w:w="3515"/>
           </w:tcPr>
           <w:p>
             <w:r/>
@@ -1467,7 +1431,7 @@
         </w:tc>
         <w:tc>
           <w:tcPr>
-            <w:tcW w:type="dxa" w:w="2551"/>
+            <w:tcW w:type="dxa" w:w="2494"/>
           </w:tcPr>
           <w:p>
             <w:r/>
@@ -1480,7 +1444,7 @@
         </w:tc>
         <w:tc>
           <w:tcPr>
-            <w:tcW w:type="dxa" w:w="2551"/>
+            <w:tcW w:type="dxa" w:w="2494"/>
           </w:tcPr>
           <w:p>
             <w:r/>
@@ -1495,7 +1459,7 @@
       <w:tr>
         <w:tc>
           <w:tcPr>
-            <w:tcW w:type="dxa" w:w="3742"/>
+            <w:tcW w:type="dxa" w:w="3515"/>
           </w:tcPr>
           <w:p>
             <w:r/>
@@ -1509,7 +1473,7 @@
         </w:tc>
         <w:tc>
           <w:tcPr>
-            <w:tcW w:type="dxa" w:w="2551"/>
+            <w:tcW w:type="dxa" w:w="2494"/>
           </w:tcPr>
           <w:p>
             <w:r/>
@@ -1522,7 +1486,7 @@
         </w:tc>
         <w:tc>
           <w:tcPr>
-            <w:tcW w:type="dxa" w:w="2551"/>
+            <w:tcW w:type="dxa" w:w="2494"/>
           </w:tcPr>
           <w:p>
             <w:r/>
@@ -1537,7 +1501,7 @@
       <w:tr>
         <w:tc>
           <w:tcPr>
-            <w:tcW w:type="dxa" w:w="3742"/>
+            <w:tcW w:type="dxa" w:w="3515"/>
           </w:tcPr>
           <w:p>
             <w:r/>
@@ -1551,7 +1515,7 @@
         </w:tc>
         <w:tc>
           <w:tcPr>
-            <w:tcW w:type="dxa" w:w="2551"/>
+            <w:tcW w:type="dxa" w:w="2494"/>
           </w:tcPr>
           <w:p>
             <w:r/>
@@ -1564,7 +1528,7 @@
         </w:tc>
         <w:tc>
           <w:tcPr>
-            <w:tcW w:type="dxa" w:w="2551"/>
+            <w:tcW w:type="dxa" w:w="2494"/>
           </w:tcPr>
           <w:p>
             <w:r/>
@@ -1579,7 +1543,7 @@
       <w:tr>
         <w:tc>
           <w:tcPr>
-            <w:tcW w:type="dxa" w:w="3742"/>
+            <w:tcW w:type="dxa" w:w="3515"/>
           </w:tcPr>
           <w:p>
             <w:r/>
@@ -1593,7 +1557,7 @@
         </w:tc>
         <w:tc>
           <w:tcPr>
-            <w:tcW w:type="dxa" w:w="2551"/>
+            <w:tcW w:type="dxa" w:w="2494"/>
           </w:tcPr>
           <w:p>
             <w:r/>
@@ -1606,7 +1570,7 @@
         </w:tc>
         <w:tc>
           <w:tcPr>
-            <w:tcW w:type="dxa" w:w="2551"/>
+            <w:tcW w:type="dxa" w:w="2494"/>
           </w:tcPr>
           <w:p>
             <w:r/>
@@ -1622,7 +1586,7 @@
       <w:tr>
         <w:tc>
           <w:tcPr>
-            <w:tcW w:type="dxa" w:w="3742"/>
+            <w:tcW w:type="dxa" w:w="3515"/>
           </w:tcPr>
           <w:p>
             <w:r/>
@@ -1636,7 +1600,7 @@
         </w:tc>
         <w:tc>
           <w:tcPr>
-            <w:tcW w:type="dxa" w:w="2551"/>
+            <w:tcW w:type="dxa" w:w="2494"/>
           </w:tcPr>
           <w:p>
             <w:r/>
@@ -1649,7 +1613,7 @@
         </w:tc>
         <w:tc>
           <w:tcPr>
-            <w:tcW w:type="dxa" w:w="2551"/>
+            <w:tcW w:type="dxa" w:w="2494"/>
           </w:tcPr>
           <w:p>
             <w:r/>
@@ -1664,7 +1628,7 @@
       <w:tr>
         <w:tc>
           <w:tcPr>
-            <w:tcW w:type="dxa" w:w="3742"/>
+            <w:tcW w:type="dxa" w:w="3515"/>
           </w:tcPr>
           <w:p>
             <w:r/>
@@ -1678,7 +1642,7 @@
         </w:tc>
         <w:tc>
           <w:tcPr>
-            <w:tcW w:type="dxa" w:w="2551"/>
+            <w:tcW w:type="dxa" w:w="2494"/>
           </w:tcPr>
           <w:p>
             <w:r/>
@@ -1691,7 +1655,7 @@
         </w:tc>
         <w:tc>
           <w:tcPr>
-            <w:tcW w:type="dxa" w:w="2551"/>
+            <w:tcW w:type="dxa" w:w="2494"/>
           </w:tcPr>
           <w:p>
             <w:r/>
@@ -1706,7 +1670,7 @@
       <w:tr>
         <w:tc>
           <w:tcPr>
-            <w:tcW w:type="dxa" w:w="3742"/>
+            <w:tcW w:type="dxa" w:w="3515"/>
           </w:tcPr>
           <w:p>
             <w:r/>
@@ -1720,7 +1684,7 @@
         </w:tc>
         <w:tc>
           <w:tcPr>
-            <w:tcW w:type="dxa" w:w="2551"/>
+            <w:tcW w:type="dxa" w:w="2494"/>
           </w:tcPr>
           <w:p>
             <w:r/>
@@ -1734,7 +1698,7 @@
         </w:tc>
         <w:tc>
           <w:tcPr>
-            <w:tcW w:type="dxa" w:w="2551"/>
+            <w:tcW w:type="dxa" w:w="2494"/>
           </w:tcPr>
           <w:p>
             <w:r/>
@@ -1749,7 +1713,7 @@
       <w:tr>
         <w:tc>
           <w:tcPr>
-            <w:tcW w:type="dxa" w:w="3742"/>
+            <w:tcW w:type="dxa" w:w="3515"/>
           </w:tcPr>
           <w:p>
             <w:r/>
@@ -1757,13 +1721,13 @@
               <w:rPr>
                 <w:sz w:val="20"/>
               </w:rPr>
-              <w:t>u_jet (m/s) (optional)</w:t>
+              <w:t>u_jet (m/s) and P (MW per m) (optional)</w:t>
             </w:r>
           </w:p>
         </w:tc>
         <w:tc>
           <w:tcPr>
-            <w:tcW w:type="dxa" w:w="2551"/>
+            <w:tcW w:type="dxa" w:w="2494"/>
           </w:tcPr>
           <w:p>
             <w:r/>
@@ -1776,49 +1740,7 @@
         </w:tc>
         <w:tc>
           <w:tcPr>
-            <w:tcW w:type="dxa" w:w="2551"/>
-          </w:tcPr>
-          <w:p>
-            <w:r/>
-            <w:r>
-              <w:rPr>
-                <w:sz w:val="20"/>
-              </w:rPr>
-            </w:r>
-          </w:p>
-        </w:tc>
-      </w:tr>
-      <w:tr>
-        <w:tc>
-          <w:tcPr>
-            <w:tcW w:type="dxa" w:w="3742"/>
-          </w:tcPr>
-          <w:p>
-            <w:r/>
-            <w:r>
-              <w:rPr>
-                <w:sz w:val="20"/>
-              </w:rPr>
-              <w:t>P per metre of width (MW) (optional)</w:t>
-            </w:r>
-          </w:p>
-        </w:tc>
-        <w:tc>
-          <w:tcPr>
-            <w:tcW w:type="dxa" w:w="2551"/>
-          </w:tcPr>
-          <w:p>
-            <w:r/>
-            <w:r>
-              <w:rPr>
-                <w:sz w:val="20"/>
-              </w:rPr>
-            </w:r>
-          </w:p>
-        </w:tc>
-        <w:tc>
-          <w:tcPr>
-            <w:tcW w:type="dxa" w:w="2551"/>
+            <w:tcW w:type="dxa" w:w="2494"/>
           </w:tcPr>
           <w:p>
             <w:r/>
@@ -1858,7 +1780,7 @@
           <w:b w:val="0"/>
           <w:i/>
         </w:rPr>
-        <w:t>Computed from the scheme's constants; two or three significant figures are all the readings support.</w:t>
+        <w:t>Computed from the constants above; two or three significant figures are all the sheet supports.</w:t>
       </w:r>
     </w:p>
     <w:tbl>
@@ -1875,7 +1797,7 @@
       <w:tr>
         <w:tc>
           <w:tcPr>
-            <w:tcW w:type="dxa" w:w="2268"/>
+            <w:tcW w:type="dxa" w:w="794"/>
           </w:tcPr>
           <w:p>
             <w:r/>
@@ -1888,7 +1810,7 @@
         </w:tc>
         <w:tc>
           <w:tcPr>
-            <w:tcW w:type="dxa" w:w="7143"/>
+            <w:tcW w:type="dxa" w:w="8277"/>
           </w:tcPr>
           <w:p>
             <w:r/>
@@ -1903,7 +1825,7 @@
       <w:tr>
         <w:tc>
           <w:tcPr>
-            <w:tcW w:type="dxa" w:w="2268"/>
+            <w:tcW w:type="dxa" w:w="794"/>
           </w:tcPr>
           <w:p>
             <w:r/>
@@ -1911,13 +1833,13 @@
               <w:rPr>
                 <w:sz w:val="20"/>
               </w:rPr>
-              <w:t>A1  headrace velocity</w:t>
+              <w:t>A1</w:t>
             </w:r>
           </w:p>
         </w:tc>
         <w:tc>
           <w:tcPr>
-            <w:tcW w:type="dxa" w:w="7143"/>
+            <w:tcW w:type="dxa" w:w="8277"/>
           </w:tcPr>
           <w:p>
             <w:r/>
@@ -1925,7 +1847,7 @@
               <w:rPr>
                 <w:sz w:val="20"/>
               </w:rPr>
-              <w:t>u₀ = q₀/D_h = 7.6/3.05 = 2.49 m/s</w:t>
+              <w:t>u₀ = 7.6/3.05 = 2.49 m/s;  u₀²/2g = 0.316 m</w:t>
             </w:r>
           </w:p>
         </w:tc>
@@ -1933,7 +1855,7 @@
       <w:tr>
         <w:tc>
           <w:tcPr>
-            <w:tcW w:type="dxa" w:w="2268"/>
+            <w:tcW w:type="dxa" w:w="794"/>
           </w:tcPr>
           <w:p>
             <w:r/>
@@ -1941,13 +1863,13 @@
               <w:rPr>
                 <w:sz w:val="20"/>
               </w:rPr>
-              <w:t>A2  friction loss</w:t>
+              <w:t>A2</w:t>
             </w:r>
           </w:p>
         </w:tc>
         <w:tc>
           <w:tcPr>
-            <w:tcW w:type="dxa" w:w="7143"/>
+            <w:tcW w:type="dxa" w:w="8277"/>
           </w:tcPr>
           <w:p>
             <w:r/>
@@ -1955,7 +1877,7 @@
               <w:rPr>
                 <w:sz w:val="20"/>
               </w:rPr>
-              <w:t>D_H = 2 × 3.05 = 6.1 m;  h_f = 0.03 × (42.4/6.1) × 2.49²/19.62 = 0.066 m</w:t>
+              <w:t>h_f = 0.03 × (42.4/6.1) × 0.316 = 0.066 m</w:t>
             </w:r>
           </w:p>
         </w:tc>
@@ -1963,7 +1885,7 @@
       <w:tr>
         <w:tc>
           <w:tcPr>
-            <w:tcW w:type="dxa" w:w="2268"/>
+            <w:tcW w:type="dxa" w:w="794"/>
           </w:tcPr>
           <w:p>
             <w:r/>
@@ -1971,13 +1893,13 @@
               <w:rPr>
                 <w:sz w:val="20"/>
               </w:rPr>
-              <w:t>A3  shaft level</w:t>
+              <w:t>A3</w:t>
             </w:r>
           </w:p>
         </w:tc>
         <w:tc>
           <w:tcPr>
-            <w:tcW w:type="dxa" w:w="7143"/>
+            <w:tcW w:type="dxa" w:w="8277"/>
           </w:tcPr>
           <w:p>
             <w:r/>
@@ -1985,7 +1907,7 @@
               <w:rPr>
                 <w:sz w:val="20"/>
               </w:rPr>
-              <w:t>u₀²/2g = 0.32 m, plus h_f = 0.066 m: z₀ = 0.38 m below the reservoir. The gauges read about 0.35 m and the shaft level wobbles by about ±0.1 m, so the 3 cm between prediction and reading is a fraction of the wobble and of one cell (0.16 m at Medium): the two agree as closely as the reading can be made. The shaft is a piezometer because it is open to the air and carries no flow; its level is the piezometric head at the knee.</w:t>
+              <w:t>z₀ = 0.316 + 0.066 = 0.38 m below the reservoir. The app reads 0.35 ± 0.05 m: inside the wobble, and the entry loss is smaller than the reading.</w:t>
             </w:r>
           </w:p>
         </w:tc>
@@ -1993,7 +1915,7 @@
       <w:tr>
         <w:tc>
           <w:tcPr>
-            <w:tcW w:type="dxa" w:w="2268"/>
+            <w:tcW w:type="dxa" w:w="794"/>
           </w:tcPr>
           <w:p>
             <w:r/>
@@ -2001,13 +1923,13 @@
               <w:rPr>
                 <w:sz w:val="20"/>
               </w:rPr>
-              <w:t>A4  loss coefficient</w:t>
+              <w:t>A4</w:t>
             </w:r>
           </w:p>
         </w:tc>
         <w:tc>
           <w:tcPr>
-            <w:tcW w:type="dxa" w:w="7143"/>
+            <w:tcW w:type="dxa" w:w="8277"/>
           </w:tcPr>
           <w:p>
             <w:r/>
@@ -2015,7 +1937,157 @@
               <w:rPr>
                 <w:sz w:val="20"/>
               </w:rPr>
-              <w:t>k = z₀/u₀² = 0.382/6.209 = 0.0616 s²/m</w:t>
+              <w:t>k = z₀/u₀² = 0.0616 s²/m</w:t>
+            </w:r>
+          </w:p>
+        </w:tc>
+      </w:tr>
+      <w:tr>
+        <w:tc>
+          <w:tcPr>
+            <w:tcW w:type="dxa" w:w="794"/>
+          </w:tcPr>
+          <w:p>
+            <w:r/>
+            <w:r>
+              <w:rPr>
+                <w:sz w:val="20"/>
+              </w:rPr>
+              <w:t>B3</w:t>
+            </w:r>
+          </w:p>
+        </w:tc>
+        <w:tc>
+          <w:tcPr>
+            <w:tcW w:type="dxa" w:w="8277"/>
+          </w:tcPr>
+          <w:p>
+            <w:r/>
+            <w:r>
+              <w:rPr>
+                <w:sz w:val="20"/>
+              </w:rPr>
+              <w:t>The crest may reach 35 − 24.9 − 3 = 7.1 m above the reservoir. With the friction crest ≈ u₀√(L·D_h/(g·D_s)) − z₀ that needs D_s ≥ 1.51 m, so about 1.5 m — where the app's slider stops. (The app throttles shafts narrower than about 2.5 m: the entry into a narrow shaft costs head and the rise falls short of the formula.)</w:t>
+            </w:r>
+          </w:p>
+        </w:tc>
+      </w:tr>
+      <w:tr>
+        <w:tc>
+          <w:tcPr>
+            <w:tcW w:type="dxa" w:w="794"/>
+          </w:tcPr>
+          <w:p>
+            <w:r/>
+            <w:r>
+              <w:rPr>
+                <w:sz w:val="20"/>
+              </w:rPr>
+              <w:t>B4</w:t>
+            </w:r>
+          </w:p>
+        </w:tc>
+        <w:tc>
+          <w:tcPr>
+            <w:tcW w:type="dxa" w:w="8277"/>
+          </w:tcPr>
+          <w:p>
+            <w:r/>
+            <w:r>
+              <w:rPr>
+                <w:sz w:val="20"/>
+              </w:rPr>
+              <w:t>Both scale with √L: × √(30/42.4) = 0.84.</w:t>
+            </w:r>
+          </w:p>
+        </w:tc>
+      </w:tr>
+      <w:tr>
+        <w:tc>
+          <w:tcPr>
+            <w:tcW w:type="dxa" w:w="794"/>
+          </w:tcPr>
+          <w:p>
+            <w:r/>
+            <w:r>
+              <w:rPr>
+                <w:sz w:val="20"/>
+              </w:rPr>
+              <w:t>C1</w:t>
+            </w:r>
+          </w:p>
+        </w:tc>
+        <w:tc>
+          <w:tcPr>
+            <w:tcW w:type="dxa" w:w="8277"/>
+          </w:tcPr>
+          <w:p>
+            <w:r/>
+            <w:r>
+              <w:rPr>
+                <w:sz w:val="20"/>
+              </w:rPr>
+              <w:t>P = ρgq(H − k_tq²); dP/dq = ρg(H − 3k_tq²) = 0 ⇒ k_tq² = H/3 = h_f.</w:t>
+            </w:r>
+          </w:p>
+        </w:tc>
+      </w:tr>
+      <w:tr>
+        <w:tc>
+          <w:tcPr>
+            <w:tcW w:type="dxa" w:w="794"/>
+          </w:tcPr>
+          <w:p>
+            <w:r/>
+            <w:r>
+              <w:rPr>
+                <w:sz w:val="20"/>
+              </w:rPr>
+              <w:t>C2</w:t>
+            </w:r>
+          </w:p>
+        </w:tc>
+        <w:tc>
+          <w:tcPr>
+            <w:tcW w:type="dxa" w:w="8277"/>
+          </w:tcPr>
+          <w:p>
+            <w:r/>
+            <w:r>
+              <w:rPr>
+                <w:sz w:val="20"/>
+              </w:rPr>
+              <w:t>u_p = 7.6/2.4 = 3.17 m/s; h_f = 0.066 (headrace) + 0.064 (penstock) = 0.13 m; H = 21.9 m; u_jet = √(19.62 × 21.77) = 20.7 m/s; P = ρ·g·q₀·(H − h_f) = 1.62 MW per m = ½ρq₀u_jet².</w:t>
+            </w:r>
+          </w:p>
+        </w:tc>
+      </w:tr>
+      <w:tr>
+        <w:tc>
+          <w:tcPr>
+            <w:tcW w:type="dxa" w:w="794"/>
+          </w:tcPr>
+          <w:p>
+            <w:r/>
+            <w:r>
+              <w:rPr>
+                <w:sz w:val="20"/>
+              </w:rPr>
+              <w:t>C3</w:t>
+            </w:r>
+          </w:p>
+        </w:tc>
+        <w:tc>
+          <w:tcPr>
+            <w:tcW w:type="dxa" w:w="8277"/>
+          </w:tcPr>
+          <w:p>
+            <w:r/>
+            <w:r>
+              <w:rPr>
+                <w:sz w:val="20"/>
+              </w:rPr>
+              <w:t>k_t = 0.00225 s²/m⁵; q* = √(21.9/(3k_t)) = 57 m²/s; u_jet = √(2g·2H/3) = 16.9 m/s; opening = q*/u_jet = 3.4 m — wider than the 2.4 m penstock, three times the slider's top (about 18 m²/s at 1.2 m). The peak cannot be reached: sweep the slider and the jet stays near √(2gH) = 20.7 m/s while the power keeps rising with the gap. (P* would be 8.2 MW per m.)</w:t>
             </w:r>
           </w:p>
         </w:tc>
@@ -2035,7 +2107,7 @@
           <w:b/>
           <w:i w:val="0"/>
         </w:rPr>
-        <w:t>B1–B2, per digit (u₀ = 2.49 m/s, z₀ = 0.382 m, k = 0.0616 s²/m, L = 42.4 m, D_h = 3.05 m; Z = L·D_h/(2·g·k·D_s) = 107.0/D_s m and C = −(Z/k)·e^(−z₀/Z)). The with-friction column is the crest equation solved by bisection:</w:t>
+        <w:t>B1, B2 — per digit (u₀ = 2.49 m/s, z₀ = 0.38 m, k = 0.0616 s²/m, L = 42.4 m, D_h = 3.05 m); the last two columns are what the app measured on the dry-run class:</w:t>
       </w:r>
     </w:p>
     <w:tbl>
@@ -2046,16 +2118,19 @@
         <w:tblLook w:firstColumn="1" w:firstRow="1" w:lastColumn="0" w:lastRow="0" w:noHBand="0" w:noVBand="1" w:val="04A0"/>
       </w:tblPr>
       <w:tblGrid>
-        <w:gridCol w:w="1949"/>
-        <w:gridCol w:w="1949"/>
-        <w:gridCol w:w="1949"/>
-        <w:gridCol w:w="1949"/>
-        <w:gridCol w:w="1949"/>
+        <w:gridCol w:w="1218"/>
+        <w:gridCol w:w="1218"/>
+        <w:gridCol w:w="1218"/>
+        <w:gridCol w:w="1218"/>
+        <w:gridCol w:w="1218"/>
+        <w:gridCol w:w="1218"/>
+        <w:gridCol w:w="1218"/>
+        <w:gridCol w:w="1218"/>
       </w:tblGrid>
       <w:tr>
         <w:tc>
           <w:tcPr>
-            <w:tcW w:type="dxa" w:w="680"/>
+            <w:tcW w:type="dxa" w:w="510"/>
           </w:tcPr>
           <w:p>
             <w:r/>
@@ -2070,7 +2145,7 @@
         </w:tc>
         <w:tc>
           <w:tcPr>
-            <w:tcW w:type="dxa" w:w="1247"/>
+            <w:tcW w:type="dxa" w:w="907"/>
           </w:tcPr>
           <w:p>
             <w:r/>
@@ -2085,7 +2160,7 @@
         </w:tc>
         <w:tc>
           <w:tcPr>
-            <w:tcW w:type="dxa" w:w="2494"/>
+            <w:tcW w:type="dxa" w:w="1474"/>
           </w:tcPr>
           <w:p>
             <w:r/>
@@ -2094,13 +2169,13 @@
                 <w:b/>
                 <w:sz w:val="20"/>
               </w:rPr>
-              <w:t>z_max, no friction (m)</w:t>
+              <w:t>z_max no friction (m)</w:t>
             </w:r>
           </w:p>
         </w:tc>
         <w:tc>
           <w:tcPr>
-            <w:tcW w:type="dxa" w:w="2608"/>
+            <w:tcW w:type="dxa" w:w="850"/>
           </w:tcPr>
           <w:p>
             <w:r/>
@@ -2109,7 +2184,37 @@
                 <w:b/>
                 <w:sz w:val="20"/>
               </w:rPr>
-              <w:t>z_max, with friction (m)</w:t>
+              <w:t>Z (m)</w:t>
+            </w:r>
+          </w:p>
+        </w:tc>
+        <w:tc>
+          <w:tcPr>
+            <w:tcW w:type="dxa" w:w="1531"/>
+          </w:tcPr>
+          <w:p>
+            <w:r/>
+            <w:r>
+              <w:rPr>
+                <w:b/>
+                <w:sz w:val="20"/>
+              </w:rPr>
+              <w:t>z_max with friction (m)</w:t>
+            </w:r>
+          </w:p>
+        </w:tc>
+        <w:tc>
+          <w:tcPr>
+            <w:tcW w:type="dxa" w:w="850"/>
+          </w:tcPr>
+          <w:p>
+            <w:r/>
+            <w:r>
+              <w:rPr>
+                <w:b/>
+                <w:sz w:val="20"/>
+              </w:rPr>
+              <w:t>T (s)</w:t>
             </w:r>
           </w:p>
         </w:tc>
@@ -2124,7 +2229,22 @@
                 <w:b/>
                 <w:sz w:val="20"/>
               </w:rPr>
-              <w:t>T (s)</w:t>
+              <w:t>app: crest (m)</w:t>
+            </w:r>
+          </w:p>
+        </w:tc>
+        <w:tc>
+          <w:tcPr>
+            <w:tcW w:type="dxa" w:w="1020"/>
+          </w:tcPr>
+          <w:p>
+            <w:r/>
+            <w:r>
+              <w:rPr>
+                <w:b/>
+                <w:sz w:val="20"/>
+              </w:rPr>
+              <w:t>app: T (s)</w:t>
             </w:r>
           </w:p>
         </w:tc>
@@ -2132,7 +2252,7 @@
       <w:tr>
         <w:tc>
           <w:tcPr>
-            <w:tcW w:type="dxa" w:w="680"/>
+            <w:tcW w:type="dxa" w:w="510"/>
           </w:tcPr>
           <w:p>
             <w:r/>
@@ -2146,7 +2266,7 @@
         </w:tc>
         <w:tc>
           <w:tcPr>
-            <w:tcW w:type="dxa" w:w="1247"/>
+            <w:tcW w:type="dxa" w:w="907"/>
           </w:tcPr>
           <w:p>
             <w:r/>
@@ -2160,7 +2280,7 @@
         </w:tc>
         <w:tc>
           <w:tcPr>
-            <w:tcW w:type="dxa" w:w="2494"/>
+            <w:tcW w:type="dxa" w:w="1474"/>
           </w:tcPr>
           <w:p>
             <w:r/>
@@ -2174,7 +2294,21 @@
         </w:tc>
         <w:tc>
           <w:tcPr>
-            <w:tcW w:type="dxa" w:w="2608"/>
+            <w:tcW w:type="dxa" w:w="850"/>
+          </w:tcPr>
+          <w:p>
+            <w:r/>
+            <w:r>
+              <w:rPr>
+                <w:sz w:val="20"/>
+              </w:rPr>
+              <w:t>42.8</w:t>
+            </w:r>
+          </w:p>
+        </w:tc>
+        <w:tc>
+          <w:tcPr>
+            <w:tcW w:type="dxa" w:w="1531"/>
           </w:tcPr>
           <w:p>
             <w:r/>
@@ -2188,7 +2322,7 @@
         </w:tc>
         <w:tc>
           <w:tcPr>
-            <w:tcW w:type="dxa" w:w="1247"/>
+            <w:tcW w:type="dxa" w:w="850"/>
           </w:tcPr>
           <w:p>
             <w:r/>
@@ -2200,11 +2334,39 @@
             </w:r>
           </w:p>
         </w:tc>
+        <w:tc>
+          <w:tcPr>
+            <w:tcW w:type="dxa" w:w="1247"/>
+          </w:tcPr>
+          <w:p>
+            <w:r/>
+            <w:r>
+              <w:rPr>
+                <w:sz w:val="20"/>
+              </w:rPr>
+              <w:t>5.16</w:t>
+            </w:r>
+          </w:p>
+        </w:tc>
+        <w:tc>
+          <w:tcPr>
+            <w:tcW w:type="dxa" w:w="1020"/>
+          </w:tcPr>
+          <w:p>
+            <w:r/>
+            <w:r>
+              <w:rPr>
+                <w:sz w:val="20"/>
+              </w:rPr>
+              <w:t>14.9</w:t>
+            </w:r>
+          </w:p>
+        </w:tc>
       </w:tr>
       <w:tr>
         <w:tc>
           <w:tcPr>
-            <w:tcW w:type="dxa" w:w="680"/>
+            <w:tcW w:type="dxa" w:w="510"/>
           </w:tcPr>
           <w:p>
             <w:r/>
@@ -2218,7 +2380,7 @@
         </w:tc>
         <w:tc>
           <w:tcPr>
-            <w:tcW w:type="dxa" w:w="1247"/>
+            <w:tcW w:type="dxa" w:w="907"/>
           </w:tcPr>
           <w:p>
             <w:r/>
@@ -2232,7 +2394,7 @@
         </w:tc>
         <w:tc>
           <w:tcPr>
-            <w:tcW w:type="dxa" w:w="2494"/>
+            <w:tcW w:type="dxa" w:w="1474"/>
           </w:tcPr>
           <w:p>
             <w:r/>
@@ -2246,7 +2408,21 @@
         </w:tc>
         <w:tc>
           <w:tcPr>
-            <w:tcW w:type="dxa" w:w="2608"/>
+            <w:tcW w:type="dxa" w:w="850"/>
+          </w:tcPr>
+          <w:p>
+            <w:r/>
+            <w:r>
+              <w:rPr>
+                <w:sz w:val="20"/>
+              </w:rPr>
+              <w:t>35.7</w:t>
+            </w:r>
+          </w:p>
+        </w:tc>
+        <w:tc>
+          <w:tcPr>
+            <w:tcW w:type="dxa" w:w="1531"/>
           </w:tcPr>
           <w:p>
             <w:r/>
@@ -2260,7 +2436,7 @@
         </w:tc>
         <w:tc>
           <w:tcPr>
-            <w:tcW w:type="dxa" w:w="1247"/>
+            <w:tcW w:type="dxa" w:w="850"/>
           </w:tcPr>
           <w:p>
             <w:r/>
@@ -2272,11 +2448,39 @@
             </w:r>
           </w:p>
         </w:tc>
+        <w:tc>
+          <w:tcPr>
+            <w:tcW w:type="dxa" w:w="1247"/>
+          </w:tcPr>
+          <w:p>
+            <w:r/>
+            <w:r>
+              <w:rPr>
+                <w:sz w:val="20"/>
+              </w:rPr>
+              <w:t>4.79</w:t>
+            </w:r>
+          </w:p>
+        </w:tc>
+        <w:tc>
+          <w:tcPr>
+            <w:tcW w:type="dxa" w:w="1020"/>
+          </w:tcPr>
+          <w:p>
+            <w:r/>
+            <w:r>
+              <w:rPr>
+                <w:sz w:val="20"/>
+              </w:rPr>
+              <w:t>16.2</w:t>
+            </w:r>
+          </w:p>
+        </w:tc>
       </w:tr>
       <w:tr>
         <w:tc>
           <w:tcPr>
-            <w:tcW w:type="dxa" w:w="680"/>
+            <w:tcW w:type="dxa" w:w="510"/>
           </w:tcPr>
           <w:p>
             <w:r/>
@@ -2290,7 +2494,7 @@
         </w:tc>
         <w:tc>
           <w:tcPr>
-            <w:tcW w:type="dxa" w:w="1247"/>
+            <w:tcW w:type="dxa" w:w="907"/>
           </w:tcPr>
           <w:p>
             <w:r/>
@@ -2304,7 +2508,7 @@
         </w:tc>
         <w:tc>
           <w:tcPr>
-            <w:tcW w:type="dxa" w:w="2494"/>
+            <w:tcW w:type="dxa" w:w="1474"/>
           </w:tcPr>
           <w:p>
             <w:r/>
@@ -2318,7 +2522,21 @@
         </w:tc>
         <w:tc>
           <w:tcPr>
-            <w:tcW w:type="dxa" w:w="2608"/>
+            <w:tcW w:type="dxa" w:w="850"/>
+          </w:tcPr>
+          <w:p>
+            <w:r/>
+            <w:r>
+              <w:rPr>
+                <w:sz w:val="20"/>
+              </w:rPr>
+              <w:t>30.6</w:t>
+            </w:r>
+          </w:p>
+        </w:tc>
+        <w:tc>
+          <w:tcPr>
+            <w:tcW w:type="dxa" w:w="1531"/>
           </w:tcPr>
           <w:p>
             <w:r/>
@@ -2332,7 +2550,7 @@
         </w:tc>
         <w:tc>
           <w:tcPr>
-            <w:tcW w:type="dxa" w:w="1247"/>
+            <w:tcW w:type="dxa" w:w="850"/>
           </w:tcPr>
           <w:p>
             <w:r/>
@@ -2344,11 +2562,39 @@
             </w:r>
           </w:p>
         </w:tc>
+        <w:tc>
+          <w:tcPr>
+            <w:tcW w:type="dxa" w:w="1247"/>
+          </w:tcPr>
+          <w:p>
+            <w:r/>
+            <w:r>
+              <w:rPr>
+                <w:sz w:val="20"/>
+              </w:rPr>
+              <w:t>4.67</w:t>
+            </w:r>
+          </w:p>
+        </w:tc>
+        <w:tc>
+          <w:tcPr>
+            <w:tcW w:type="dxa" w:w="1020"/>
+          </w:tcPr>
+          <w:p>
+            <w:r/>
+            <w:r>
+              <w:rPr>
+                <w:sz w:val="20"/>
+              </w:rPr>
+              <w:t>17.6</w:t>
+            </w:r>
+          </w:p>
+        </w:tc>
       </w:tr>
       <w:tr>
         <w:tc>
           <w:tcPr>
-            <w:tcW w:type="dxa" w:w="680"/>
+            <w:tcW w:type="dxa" w:w="510"/>
           </w:tcPr>
           <w:p>
             <w:r/>
@@ -2362,7 +2608,7 @@
         </w:tc>
         <w:tc>
           <w:tcPr>
-            <w:tcW w:type="dxa" w:w="1247"/>
+            <w:tcW w:type="dxa" w:w="907"/>
           </w:tcPr>
           <w:p>
             <w:r/>
@@ -2376,7 +2622,7 @@
         </w:tc>
         <w:tc>
           <w:tcPr>
-            <w:tcW w:type="dxa" w:w="2494"/>
+            <w:tcW w:type="dxa" w:w="1474"/>
           </w:tcPr>
           <w:p>
             <w:r/>
@@ -2390,7 +2636,21 @@
         </w:tc>
         <w:tc>
           <w:tcPr>
-            <w:tcW w:type="dxa" w:w="2608"/>
+            <w:tcW w:type="dxa" w:w="850"/>
+          </w:tcPr>
+          <w:p>
+            <w:r/>
+            <w:r>
+              <w:rPr>
+                <w:sz w:val="20"/>
+              </w:rPr>
+              <w:t>26.8</w:t>
+            </w:r>
+          </w:p>
+        </w:tc>
+        <w:tc>
+          <w:tcPr>
+            <w:tcW w:type="dxa" w:w="1531"/>
           </w:tcPr>
           <w:p>
             <w:r/>
@@ -2404,7 +2664,7 @@
         </w:tc>
         <w:tc>
           <w:tcPr>
-            <w:tcW w:type="dxa" w:w="1247"/>
+            <w:tcW w:type="dxa" w:w="850"/>
           </w:tcPr>
           <w:p>
             <w:r/>
@@ -2413,22 +2673,6 @@
                 <w:sz w:val="20"/>
               </w:rPr>
               <w:t>15.0</w:t>
-            </w:r>
-          </w:p>
-        </w:tc>
-      </w:tr>
-      <w:tr>
-        <w:tc>
-          <w:tcPr>
-            <w:tcW w:type="dxa" w:w="680"/>
-          </w:tcPr>
-          <w:p>
-            <w:r/>
-            <w:r>
-              <w:rPr>
-                <w:sz w:val="20"/>
-              </w:rPr>
-              <w:t>4</w:t>
             </w:r>
           </w:p>
         </w:tc>
@@ -2442,329 +2686,13 @@
               <w:rPr>
                 <w:sz w:val="20"/>
               </w:rPr>
-              <w:t>4.5</w:t>
+              <w:t>4.18</w:t>
             </w:r>
           </w:p>
         </w:tc>
         <w:tc>
           <w:tcPr>
-            <w:tcW w:type="dxa" w:w="2494"/>
-          </w:tcPr>
-          <w:p>
-            <w:r/>
-            <w:r>
-              <w:rPr>
-                <w:sz w:val="20"/>
-              </w:rPr>
-              <w:t>4.26</w:t>
-            </w:r>
-          </w:p>
-        </w:tc>
-        <w:tc>
-          <w:tcPr>
-            <w:tcW w:type="dxa" w:w="2608"/>
-          </w:tcPr>
-          <w:p>
-            <w:r/>
-            <w:r>
-              <w:rPr>
-                <w:sz w:val="20"/>
-              </w:rPr>
-              <w:t>4.01</w:t>
-            </w:r>
-          </w:p>
-        </w:tc>
-        <w:tc>
-          <w:tcPr>
-            <w:tcW w:type="dxa" w:w="1247"/>
-          </w:tcPr>
-          <w:p>
-            <w:r/>
-            <w:r>
-              <w:rPr>
-                <w:sz w:val="20"/>
-              </w:rPr>
-              <w:t>15.9</w:t>
-            </w:r>
-          </w:p>
-        </w:tc>
-      </w:tr>
-      <w:tr>
-        <w:tc>
-          <w:tcPr>
-            <w:tcW w:type="dxa" w:w="680"/>
-          </w:tcPr>
-          <w:p>
-            <w:r/>
-            <w:r>
-              <w:rPr>
-                <w:sz w:val="20"/>
-              </w:rPr>
-              <w:t>5</w:t>
-            </w:r>
-          </w:p>
-        </w:tc>
-        <w:tc>
-          <w:tcPr>
-            <w:tcW w:type="dxa" w:w="1247"/>
-          </w:tcPr>
-          <w:p>
-            <w:r/>
-            <w:r>
-              <w:rPr>
-                <w:sz w:val="20"/>
-              </w:rPr>
-              <w:t>5.0</w:t>
-            </w:r>
-          </w:p>
-        </w:tc>
-        <w:tc>
-          <w:tcPr>
-            <w:tcW w:type="dxa" w:w="2494"/>
-          </w:tcPr>
-          <w:p>
-            <w:r/>
-            <w:r>
-              <w:rPr>
-                <w:sz w:val="20"/>
-              </w:rPr>
-              <w:t>4.05</w:t>
-            </w:r>
-          </w:p>
-        </w:tc>
-        <w:tc>
-          <w:tcPr>
-            <w:tcW w:type="dxa" w:w="2608"/>
-          </w:tcPr>
-          <w:p>
-            <w:r/>
-            <w:r>
-              <w:rPr>
-                <w:sz w:val="20"/>
-              </w:rPr>
-              <w:t>3.80</w:t>
-            </w:r>
-          </w:p>
-        </w:tc>
-        <w:tc>
-          <w:tcPr>
-            <w:tcW w:type="dxa" w:w="1247"/>
-          </w:tcPr>
-          <w:p>
-            <w:r/>
-            <w:r>
-              <w:rPr>
-                <w:sz w:val="20"/>
-              </w:rPr>
-              <w:t>16.7</w:t>
-            </w:r>
-          </w:p>
-        </w:tc>
-      </w:tr>
-      <w:tr>
-        <w:tc>
-          <w:tcPr>
-            <w:tcW w:type="dxa" w:w="680"/>
-          </w:tcPr>
-          <w:p>
-            <w:r/>
-            <w:r>
-              <w:rPr>
-                <w:sz w:val="20"/>
-              </w:rPr>
-              <w:t>6</w:t>
-            </w:r>
-          </w:p>
-        </w:tc>
-        <w:tc>
-          <w:tcPr>
-            <w:tcW w:type="dxa" w:w="1247"/>
-          </w:tcPr>
-          <w:p>
-            <w:r/>
-            <w:r>
-              <w:rPr>
-                <w:sz w:val="20"/>
-              </w:rPr>
-              <w:t>5.5</w:t>
-            </w:r>
-          </w:p>
-        </w:tc>
-        <w:tc>
-          <w:tcPr>
-            <w:tcW w:type="dxa" w:w="2494"/>
-          </w:tcPr>
-          <w:p>
-            <w:r/>
-            <w:r>
-              <w:rPr>
-                <w:sz w:val="20"/>
-              </w:rPr>
-              <w:t>3.86</w:t>
-            </w:r>
-          </w:p>
-        </w:tc>
-        <w:tc>
-          <w:tcPr>
-            <w:tcW w:type="dxa" w:w="2608"/>
-          </w:tcPr>
-          <w:p>
-            <w:r/>
-            <w:r>
-              <w:rPr>
-                <w:sz w:val="20"/>
-              </w:rPr>
-              <w:t>3.61</w:t>
-            </w:r>
-          </w:p>
-        </w:tc>
-        <w:tc>
-          <w:tcPr>
-            <w:tcW w:type="dxa" w:w="1247"/>
-          </w:tcPr>
-          <w:p>
-            <w:r/>
-            <w:r>
-              <w:rPr>
-                <w:sz w:val="20"/>
-              </w:rPr>
-              <w:t>17.5</w:t>
-            </w:r>
-          </w:p>
-        </w:tc>
-      </w:tr>
-      <w:tr>
-        <w:tc>
-          <w:tcPr>
-            <w:tcW w:type="dxa" w:w="680"/>
-          </w:tcPr>
-          <w:p>
-            <w:r/>
-            <w:r>
-              <w:rPr>
-                <w:sz w:val="20"/>
-              </w:rPr>
-              <w:t>7</w:t>
-            </w:r>
-          </w:p>
-        </w:tc>
-        <w:tc>
-          <w:tcPr>
-            <w:tcW w:type="dxa" w:w="1247"/>
-          </w:tcPr>
-          <w:p>
-            <w:r/>
-            <w:r>
-              <w:rPr>
-                <w:sz w:val="20"/>
-              </w:rPr>
-              <w:t>6.0</w:t>
-            </w:r>
-          </w:p>
-        </w:tc>
-        <w:tc>
-          <w:tcPr>
-            <w:tcW w:type="dxa" w:w="2494"/>
-          </w:tcPr>
-          <w:p>
-            <w:r/>
-            <w:r>
-              <w:rPr>
-                <w:sz w:val="20"/>
-              </w:rPr>
-              <w:t>3.69</w:t>
-            </w:r>
-          </w:p>
-        </w:tc>
-        <w:tc>
-          <w:tcPr>
-            <w:tcW w:type="dxa" w:w="2608"/>
-          </w:tcPr>
-          <w:p>
-            <w:r/>
-            <w:r>
-              <w:rPr>
-                <w:sz w:val="20"/>
-              </w:rPr>
-              <w:t>3.44</w:t>
-            </w:r>
-          </w:p>
-        </w:tc>
-        <w:tc>
-          <w:tcPr>
-            <w:tcW w:type="dxa" w:w="1247"/>
-          </w:tcPr>
-          <w:p>
-            <w:r/>
-            <w:r>
-              <w:rPr>
-                <w:sz w:val="20"/>
-              </w:rPr>
-              <w:t>18.3</w:t>
-            </w:r>
-          </w:p>
-        </w:tc>
-      </w:tr>
-      <w:tr>
-        <w:tc>
-          <w:tcPr>
-            <w:tcW w:type="dxa" w:w="680"/>
-          </w:tcPr>
-          <w:p>
-            <w:r/>
-            <w:r>
-              <w:rPr>
-                <w:sz w:val="20"/>
-              </w:rPr>
-              <w:t>8</w:t>
-            </w:r>
-          </w:p>
-        </w:tc>
-        <w:tc>
-          <w:tcPr>
-            <w:tcW w:type="dxa" w:w="1247"/>
-          </w:tcPr>
-          <w:p>
-            <w:r/>
-            <w:r>
-              <w:rPr>
-                <w:sz w:val="20"/>
-              </w:rPr>
-              <w:t>6.5</w:t>
-            </w:r>
-          </w:p>
-        </w:tc>
-        <w:tc>
-          <w:tcPr>
-            <w:tcW w:type="dxa" w:w="2494"/>
-          </w:tcPr>
-          <w:p>
-            <w:r/>
-            <w:r>
-              <w:rPr>
-                <w:sz w:val="20"/>
-              </w:rPr>
-              <w:t>3.55</w:t>
-            </w:r>
-          </w:p>
-        </w:tc>
-        <w:tc>
-          <w:tcPr>
-            <w:tcW w:type="dxa" w:w="2608"/>
-          </w:tcPr>
-          <w:p>
-            <w:r/>
-            <w:r>
-              <w:rPr>
-                <w:sz w:val="20"/>
-              </w:rPr>
-              <w:t>3.30</w:t>
-            </w:r>
-          </w:p>
-        </w:tc>
-        <w:tc>
-          <w:tcPr>
-            <w:tcW w:type="dxa" w:w="1247"/>
+            <w:tcW w:type="dxa" w:w="1020"/>
           </w:tcPr>
           <w:p>
             <w:r/>
@@ -2780,7 +2708,577 @@
       <w:tr>
         <w:tc>
           <w:tcPr>
-            <w:tcW w:type="dxa" w:w="680"/>
+            <w:tcW w:type="dxa" w:w="510"/>
+          </w:tcPr>
+          <w:p>
+            <w:r/>
+            <w:r>
+              <w:rPr>
+                <w:sz w:val="20"/>
+              </w:rPr>
+              <w:t>4</w:t>
+            </w:r>
+          </w:p>
+        </w:tc>
+        <w:tc>
+          <w:tcPr>
+            <w:tcW w:type="dxa" w:w="907"/>
+          </w:tcPr>
+          <w:p>
+            <w:r/>
+            <w:r>
+              <w:rPr>
+                <w:sz w:val="20"/>
+              </w:rPr>
+              <w:t>4.5</w:t>
+            </w:r>
+          </w:p>
+        </w:tc>
+        <w:tc>
+          <w:tcPr>
+            <w:tcW w:type="dxa" w:w="1474"/>
+          </w:tcPr>
+          <w:p>
+            <w:r/>
+            <w:r>
+              <w:rPr>
+                <w:sz w:val="20"/>
+              </w:rPr>
+              <w:t>4.26</w:t>
+            </w:r>
+          </w:p>
+        </w:tc>
+        <w:tc>
+          <w:tcPr>
+            <w:tcW w:type="dxa" w:w="850"/>
+          </w:tcPr>
+          <w:p>
+            <w:r/>
+            <w:r>
+              <w:rPr>
+                <w:sz w:val="20"/>
+              </w:rPr>
+              <w:t>23.8</w:t>
+            </w:r>
+          </w:p>
+        </w:tc>
+        <w:tc>
+          <w:tcPr>
+            <w:tcW w:type="dxa" w:w="1531"/>
+          </w:tcPr>
+          <w:p>
+            <w:r/>
+            <w:r>
+              <w:rPr>
+                <w:sz w:val="20"/>
+              </w:rPr>
+              <w:t>4.01</w:t>
+            </w:r>
+          </w:p>
+        </w:tc>
+        <w:tc>
+          <w:tcPr>
+            <w:tcW w:type="dxa" w:w="850"/>
+          </w:tcPr>
+          <w:p>
+            <w:r/>
+            <w:r>
+              <w:rPr>
+                <w:sz w:val="20"/>
+              </w:rPr>
+              <w:t>15.9</w:t>
+            </w:r>
+          </w:p>
+        </w:tc>
+        <w:tc>
+          <w:tcPr>
+            <w:tcW w:type="dxa" w:w="1247"/>
+          </w:tcPr>
+          <w:p>
+            <w:r/>
+            <w:r>
+              <w:rPr>
+                <w:sz w:val="20"/>
+              </w:rPr>
+              <w:t>3.99</w:t>
+            </w:r>
+          </w:p>
+        </w:tc>
+        <w:tc>
+          <w:tcPr>
+            <w:tcW w:type="dxa" w:w="1020"/>
+          </w:tcPr>
+          <w:p>
+            <w:r/>
+            <w:r>
+              <w:rPr>
+                <w:sz w:val="20"/>
+              </w:rPr>
+              <w:t>18.9</w:t>
+            </w:r>
+          </w:p>
+        </w:tc>
+      </w:tr>
+      <w:tr>
+        <w:tc>
+          <w:tcPr>
+            <w:tcW w:type="dxa" w:w="510"/>
+          </w:tcPr>
+          <w:p>
+            <w:r/>
+            <w:r>
+              <w:rPr>
+                <w:sz w:val="20"/>
+              </w:rPr>
+              <w:t>5</w:t>
+            </w:r>
+          </w:p>
+        </w:tc>
+        <w:tc>
+          <w:tcPr>
+            <w:tcW w:type="dxa" w:w="907"/>
+          </w:tcPr>
+          <w:p>
+            <w:r/>
+            <w:r>
+              <w:rPr>
+                <w:sz w:val="20"/>
+              </w:rPr>
+              <w:t>5.0</w:t>
+            </w:r>
+          </w:p>
+        </w:tc>
+        <w:tc>
+          <w:tcPr>
+            <w:tcW w:type="dxa" w:w="1474"/>
+          </w:tcPr>
+          <w:p>
+            <w:r/>
+            <w:r>
+              <w:rPr>
+                <w:sz w:val="20"/>
+              </w:rPr>
+              <w:t>4.05</w:t>
+            </w:r>
+          </w:p>
+        </w:tc>
+        <w:tc>
+          <w:tcPr>
+            <w:tcW w:type="dxa" w:w="850"/>
+          </w:tcPr>
+          <w:p>
+            <w:r/>
+            <w:r>
+              <w:rPr>
+                <w:sz w:val="20"/>
+              </w:rPr>
+              <w:t>21.4</w:t>
+            </w:r>
+          </w:p>
+        </w:tc>
+        <w:tc>
+          <w:tcPr>
+            <w:tcW w:type="dxa" w:w="1531"/>
+          </w:tcPr>
+          <w:p>
+            <w:r/>
+            <w:r>
+              <w:rPr>
+                <w:sz w:val="20"/>
+              </w:rPr>
+              <w:t>3.80</w:t>
+            </w:r>
+          </w:p>
+        </w:tc>
+        <w:tc>
+          <w:tcPr>
+            <w:tcW w:type="dxa" w:w="850"/>
+          </w:tcPr>
+          <w:p>
+            <w:r/>
+            <w:r>
+              <w:rPr>
+                <w:sz w:val="20"/>
+              </w:rPr>
+              <w:t>16.7</w:t>
+            </w:r>
+          </w:p>
+        </w:tc>
+        <w:tc>
+          <w:tcPr>
+            <w:tcW w:type="dxa" w:w="1247"/>
+          </w:tcPr>
+          <w:p>
+            <w:r/>
+            <w:r>
+              <w:rPr>
+                <w:sz w:val="20"/>
+              </w:rPr>
+              <w:t>3.79</w:t>
+            </w:r>
+          </w:p>
+        </w:tc>
+        <w:tc>
+          <w:tcPr>
+            <w:tcW w:type="dxa" w:w="1020"/>
+          </w:tcPr>
+          <w:p>
+            <w:r/>
+            <w:r>
+              <w:rPr>
+                <w:sz w:val="20"/>
+              </w:rPr>
+              <w:t>19.8</w:t>
+            </w:r>
+          </w:p>
+        </w:tc>
+      </w:tr>
+      <w:tr>
+        <w:tc>
+          <w:tcPr>
+            <w:tcW w:type="dxa" w:w="510"/>
+          </w:tcPr>
+          <w:p>
+            <w:r/>
+            <w:r>
+              <w:rPr>
+                <w:sz w:val="20"/>
+              </w:rPr>
+              <w:t>6</w:t>
+            </w:r>
+          </w:p>
+        </w:tc>
+        <w:tc>
+          <w:tcPr>
+            <w:tcW w:type="dxa" w:w="907"/>
+          </w:tcPr>
+          <w:p>
+            <w:r/>
+            <w:r>
+              <w:rPr>
+                <w:sz w:val="20"/>
+              </w:rPr>
+              <w:t>5.5</w:t>
+            </w:r>
+          </w:p>
+        </w:tc>
+        <w:tc>
+          <w:tcPr>
+            <w:tcW w:type="dxa" w:w="1474"/>
+          </w:tcPr>
+          <w:p>
+            <w:r/>
+            <w:r>
+              <w:rPr>
+                <w:sz w:val="20"/>
+              </w:rPr>
+              <w:t>3.86</w:t>
+            </w:r>
+          </w:p>
+        </w:tc>
+        <w:tc>
+          <w:tcPr>
+            <w:tcW w:type="dxa" w:w="850"/>
+          </w:tcPr>
+          <w:p>
+            <w:r/>
+            <w:r>
+              <w:rPr>
+                <w:sz w:val="20"/>
+              </w:rPr>
+              <w:t>19.5</w:t>
+            </w:r>
+          </w:p>
+        </w:tc>
+        <w:tc>
+          <w:tcPr>
+            <w:tcW w:type="dxa" w:w="1531"/>
+          </w:tcPr>
+          <w:p>
+            <w:r/>
+            <w:r>
+              <w:rPr>
+                <w:sz w:val="20"/>
+              </w:rPr>
+              <w:t>3.61</w:t>
+            </w:r>
+          </w:p>
+        </w:tc>
+        <w:tc>
+          <w:tcPr>
+            <w:tcW w:type="dxa" w:w="850"/>
+          </w:tcPr>
+          <w:p>
+            <w:r/>
+            <w:r>
+              <w:rPr>
+                <w:sz w:val="20"/>
+              </w:rPr>
+              <w:t>17.5</w:t>
+            </w:r>
+          </w:p>
+        </w:tc>
+        <w:tc>
+          <w:tcPr>
+            <w:tcW w:type="dxa" w:w="1247"/>
+          </w:tcPr>
+          <w:p>
+            <w:r/>
+            <w:r>
+              <w:rPr>
+                <w:sz w:val="20"/>
+              </w:rPr>
+              <w:t>3.70</w:t>
+            </w:r>
+          </w:p>
+        </w:tc>
+        <w:tc>
+          <w:tcPr>
+            <w:tcW w:type="dxa" w:w="1020"/>
+          </w:tcPr>
+          <w:p>
+            <w:r/>
+            <w:r>
+              <w:rPr>
+                <w:sz w:val="20"/>
+              </w:rPr>
+              <w:t>21.2</w:t>
+            </w:r>
+          </w:p>
+        </w:tc>
+      </w:tr>
+      <w:tr>
+        <w:tc>
+          <w:tcPr>
+            <w:tcW w:type="dxa" w:w="510"/>
+          </w:tcPr>
+          <w:p>
+            <w:r/>
+            <w:r>
+              <w:rPr>
+                <w:sz w:val="20"/>
+              </w:rPr>
+              <w:t>7</w:t>
+            </w:r>
+          </w:p>
+        </w:tc>
+        <w:tc>
+          <w:tcPr>
+            <w:tcW w:type="dxa" w:w="907"/>
+          </w:tcPr>
+          <w:p>
+            <w:r/>
+            <w:r>
+              <w:rPr>
+                <w:sz w:val="20"/>
+              </w:rPr>
+              <w:t>6.0</w:t>
+            </w:r>
+          </w:p>
+        </w:tc>
+        <w:tc>
+          <w:tcPr>
+            <w:tcW w:type="dxa" w:w="1474"/>
+          </w:tcPr>
+          <w:p>
+            <w:r/>
+            <w:r>
+              <w:rPr>
+                <w:sz w:val="20"/>
+              </w:rPr>
+              <w:t>3.69</w:t>
+            </w:r>
+          </w:p>
+        </w:tc>
+        <w:tc>
+          <w:tcPr>
+            <w:tcW w:type="dxa" w:w="850"/>
+          </w:tcPr>
+          <w:p>
+            <w:r/>
+            <w:r>
+              <w:rPr>
+                <w:sz w:val="20"/>
+              </w:rPr>
+              <w:t>17.8</w:t>
+            </w:r>
+          </w:p>
+        </w:tc>
+        <w:tc>
+          <w:tcPr>
+            <w:tcW w:type="dxa" w:w="1531"/>
+          </w:tcPr>
+          <w:p>
+            <w:r/>
+            <w:r>
+              <w:rPr>
+                <w:sz w:val="20"/>
+              </w:rPr>
+              <w:t>3.44</w:t>
+            </w:r>
+          </w:p>
+        </w:tc>
+        <w:tc>
+          <w:tcPr>
+            <w:tcW w:type="dxa" w:w="850"/>
+          </w:tcPr>
+          <w:p>
+            <w:r/>
+            <w:r>
+              <w:rPr>
+                <w:sz w:val="20"/>
+              </w:rPr>
+              <w:t>18.3</w:t>
+            </w:r>
+          </w:p>
+        </w:tc>
+        <w:tc>
+          <w:tcPr>
+            <w:tcW w:type="dxa" w:w="1247"/>
+          </w:tcPr>
+          <w:p>
+            <w:r/>
+            <w:r>
+              <w:rPr>
+                <w:sz w:val="20"/>
+              </w:rPr>
+              <w:t>3.58</w:t>
+            </w:r>
+          </w:p>
+        </w:tc>
+        <w:tc>
+          <w:tcPr>
+            <w:tcW w:type="dxa" w:w="1020"/>
+          </w:tcPr>
+          <w:p>
+            <w:r/>
+            <w:r>
+              <w:rPr>
+                <w:sz w:val="20"/>
+              </w:rPr>
+              <w:t>21.0</w:t>
+            </w:r>
+          </w:p>
+        </w:tc>
+      </w:tr>
+      <w:tr>
+        <w:tc>
+          <w:tcPr>
+            <w:tcW w:type="dxa" w:w="510"/>
+          </w:tcPr>
+          <w:p>
+            <w:r/>
+            <w:r>
+              <w:rPr>
+                <w:sz w:val="20"/>
+              </w:rPr>
+              <w:t>8</w:t>
+            </w:r>
+          </w:p>
+        </w:tc>
+        <w:tc>
+          <w:tcPr>
+            <w:tcW w:type="dxa" w:w="907"/>
+          </w:tcPr>
+          <w:p>
+            <w:r/>
+            <w:r>
+              <w:rPr>
+                <w:sz w:val="20"/>
+              </w:rPr>
+              <w:t>6.5</w:t>
+            </w:r>
+          </w:p>
+        </w:tc>
+        <w:tc>
+          <w:tcPr>
+            <w:tcW w:type="dxa" w:w="1474"/>
+          </w:tcPr>
+          <w:p>
+            <w:r/>
+            <w:r>
+              <w:rPr>
+                <w:sz w:val="20"/>
+              </w:rPr>
+              <w:t>3.55</w:t>
+            </w:r>
+          </w:p>
+        </w:tc>
+        <w:tc>
+          <w:tcPr>
+            <w:tcW w:type="dxa" w:w="850"/>
+          </w:tcPr>
+          <w:p>
+            <w:r/>
+            <w:r>
+              <w:rPr>
+                <w:sz w:val="20"/>
+              </w:rPr>
+              <w:t>16.5</w:t>
+            </w:r>
+          </w:p>
+        </w:tc>
+        <w:tc>
+          <w:tcPr>
+            <w:tcW w:type="dxa" w:w="1531"/>
+          </w:tcPr>
+          <w:p>
+            <w:r/>
+            <w:r>
+              <w:rPr>
+                <w:sz w:val="20"/>
+              </w:rPr>
+              <w:t>3.30</w:t>
+            </w:r>
+          </w:p>
+        </w:tc>
+        <w:tc>
+          <w:tcPr>
+            <w:tcW w:type="dxa" w:w="850"/>
+          </w:tcPr>
+          <w:p>
+            <w:r/>
+            <w:r>
+              <w:rPr>
+                <w:sz w:val="20"/>
+              </w:rPr>
+              <w:t>19.1</w:t>
+            </w:r>
+          </w:p>
+        </w:tc>
+        <w:tc>
+          <w:tcPr>
+            <w:tcW w:type="dxa" w:w="1247"/>
+          </w:tcPr>
+          <w:p>
+            <w:r/>
+            <w:r>
+              <w:rPr>
+                <w:sz w:val="20"/>
+              </w:rPr>
+              <w:t>3.27</w:t>
+            </w:r>
+          </w:p>
+        </w:tc>
+        <w:tc>
+          <w:tcPr>
+            <w:tcW w:type="dxa" w:w="1020"/>
+          </w:tcPr>
+          <w:p>
+            <w:r/>
+            <w:r>
+              <w:rPr>
+                <w:sz w:val="20"/>
+              </w:rPr>
+              <w:t>22.2</w:t>
+            </w:r>
+          </w:p>
+        </w:tc>
+      </w:tr>
+      <w:tr>
+        <w:tc>
+          <w:tcPr>
+            <w:tcW w:type="dxa" w:w="510"/>
           </w:tcPr>
           <w:p>
             <w:r/>
@@ -2794,7 +3292,7 @@
         </w:tc>
         <w:tc>
           <w:tcPr>
-            <w:tcW w:type="dxa" w:w="1247"/>
+            <w:tcW w:type="dxa" w:w="907"/>
           </w:tcPr>
           <w:p>
             <w:r/>
@@ -2808,7 +3306,7 @@
         </w:tc>
         <w:tc>
           <w:tcPr>
-            <w:tcW w:type="dxa" w:w="2494"/>
+            <w:tcW w:type="dxa" w:w="1474"/>
           </w:tcPr>
           <w:p>
             <w:r/>
@@ -2822,7 +3320,21 @@
         </w:tc>
         <w:tc>
           <w:tcPr>
-            <w:tcW w:type="dxa" w:w="2608"/>
+            <w:tcW w:type="dxa" w:w="850"/>
+          </w:tcPr>
+          <w:p>
+            <w:r/>
+            <w:r>
+              <w:rPr>
+                <w:sz w:val="20"/>
+              </w:rPr>
+              <w:t>15.3</w:t>
+            </w:r>
+          </w:p>
+        </w:tc>
+        <w:tc>
+          <w:tcPr>
+            <w:tcW w:type="dxa" w:w="1531"/>
           </w:tcPr>
           <w:p>
             <w:r/>
@@ -2836,7 +3348,7 @@
         </w:tc>
         <w:tc>
           <w:tcPr>
-            <w:tcW w:type="dxa" w:w="1247"/>
+            <w:tcW w:type="dxa" w:w="850"/>
           </w:tcPr>
           <w:p>
             <w:r/>
@@ -2848,28 +3360,9 @@
             </w:r>
           </w:p>
         </w:tc>
-      </w:tr>
-    </w:tbl>
-    <w:p>
-      <w:pPr>
-        <w:spacing w:after="40"/>
-      </w:pPr>
-    </w:p>
-    <w:tbl>
-      <w:tblPr>
-        <w:tblStyle w:val="TableGrid"/>
-        <w:tblW w:type="auto" w:w="0"/>
-        <w:jc w:val="center"/>
-        <w:tblLook w:firstColumn="1" w:firstRow="1" w:lastColumn="0" w:lastRow="0" w:noHBand="0" w:noVBand="1" w:val="04A0"/>
-      </w:tblPr>
-      <w:tblGrid>
-        <w:gridCol w:w="4873"/>
-        <w:gridCol w:w="4873"/>
-      </w:tblGrid>
-      <w:tr>
         <w:tc>
           <w:tcPr>
-            <w:tcW w:type="dxa" w:w="2268"/>
+            <w:tcW w:type="dxa" w:w="1247"/>
           </w:tcPr>
           <w:p>
             <w:r/>
@@ -2877,12 +3370,13 @@
               <w:rPr>
                 <w:sz w:val="20"/>
               </w:rPr>
+              <w:t>3.22</w:t>
             </w:r>
           </w:p>
         </w:tc>
         <w:tc>
           <w:tcPr>
-            <w:tcW w:type="dxa" w:w="7143"/>
+            <w:tcW w:type="dxa" w:w="1020"/>
           </w:tcPr>
           <w:p>
             <w:r/>
@@ -2890,156 +3384,7 @@
               <w:rPr>
                 <w:sz w:val="20"/>
               </w:rPr>
-            </w:r>
-          </w:p>
-        </w:tc>
-      </w:tr>
-      <w:tr>
-        <w:tc>
-          <w:tcPr>
-            <w:tcW w:type="dxa" w:w="2268"/>
-          </w:tcPr>
-          <w:p>
-            <w:r/>
-            <w:r>
-              <w:rPr>
-                <w:sz w:val="20"/>
-              </w:rPr>
-              <w:t>B3  freeboard</w:t>
-            </w:r>
-          </w:p>
-        </w:tc>
-        <w:tc>
-          <w:tcPr>
-            <w:tcW w:type="dxa" w:w="7143"/>
-          </w:tcPr>
-          <w:p>
-            <w:r/>
-            <w:r>
-              <w:rPr>
-                <w:sz w:val="20"/>
-              </w:rPr>
-              <w:t>Crest above datum = 24.9 + z_max: 30.4 m for d = 0 and 28.1 m for d = 9, against a freeboard line at 32.0 m, so every digit's shaft holds the first upsurge, d = 0 with 1.6 m to spare. The crest may stand at most 7.1 m above the reservoir; u₀·√(L·D_h/(g·D_s)) − z₀ ≤ 7.1 gives D_s ≥ 1.46 m, i.e. 1.5 m to 0.1 m, which is where the app's slider stops (the full crest equation puts the limit at 1.51 m). Shafts narrower than about 2.5 m throttle themselves in the app and rise less than the formula says.</w:t>
-            </w:r>
-          </w:p>
-        </w:tc>
-      </w:tr>
-      <w:tr>
-        <w:tc>
-          <w:tcPr>
-            <w:tcW w:type="dxa" w:w="2268"/>
-          </w:tcPr>
-          <w:p>
-            <w:r/>
-            <w:r>
-              <w:rPr>
-                <w:sz w:val="20"/>
-              </w:rPr>
-              <w:t>B4  the knee moved</w:t>
-            </w:r>
-          </w:p>
-        </w:tc>
-        <w:tc>
-          <w:tcPr>
-            <w:tcW w:type="dxa" w:w="7143"/>
-          </w:tcPr>
-          <w:p>
-            <w:r/>
-            <w:r>
-              <w:rPr>
-                <w:sz w:val="20"/>
-              </w:rPr>
-              <w:t>Both z_max and T scale as √L: × √(30/42.4) = 0.84. For d = 0 the frictionless crest would be 4.81 m and T 9.9 s.</w:t>
-            </w:r>
-          </w:p>
-        </w:tc>
-      </w:tr>
-      <w:tr>
-        <w:tc>
-          <w:tcPr>
-            <w:tcW w:type="dxa" w:w="2268"/>
-          </w:tcPr>
-          <w:p>
-            <w:r/>
-            <w:r>
-              <w:rPr>
-                <w:sz w:val="20"/>
-              </w:rPr>
-              <w:t>C1</w:t>
-            </w:r>
-          </w:p>
-        </w:tc>
-        <w:tc>
-          <w:tcPr>
-            <w:tcW w:type="dxa" w:w="7143"/>
-          </w:tcPr>
-          <w:p>
-            <w:r/>
-            <w:r>
-              <w:rPr>
-                <w:sz w:val="20"/>
-              </w:rPr>
-              <w:t>P = ρ·g·q·(H − k_t·q²); dP/dq = ρ·g·(H − 3·k_t·q²) = 0 ⇒ k_t·q² = H/3 = h_f.</w:t>
-            </w:r>
-          </w:p>
-        </w:tc>
-      </w:tr>
-      <w:tr>
-        <w:tc>
-          <w:tcPr>
-            <w:tcW w:type="dxa" w:w="2268"/>
-          </w:tcPr>
-          <w:p>
-            <w:r/>
-            <w:r>
-              <w:rPr>
-                <w:sz w:val="20"/>
-              </w:rPr>
-              <w:t>C2  design point</w:t>
-            </w:r>
-          </w:p>
-        </w:tc>
-        <w:tc>
-          <w:tcPr>
-            <w:tcW w:type="dxa" w:w="7143"/>
-          </w:tcPr>
-          <w:p>
-            <w:r/>
-            <w:r>
-              <w:rPr>
-                <w:sz w:val="20"/>
-              </w:rPr>
-              <w:t>k_t = 0.00114 (headrace) + 0.00111 (penstock) = 0.00225 s²/m³; h_f = k_t·q₀² = 0.13 m, 0.6% of H = 21.9 m. u_jet = √(2g × 21.77) = 20.7 m/s (the app reads about 20.6 m/s). P = ρ·g·q₀·(H − h_f) = 1.62 MW per metre of width, and ½·ρ·q₀·u_jet² = 1.62 MW.</w:t>
-            </w:r>
-          </w:p>
-        </w:tc>
-      </w:tr>
-      <w:tr>
-        <w:tc>
-          <w:tcPr>
-            <w:tcW w:type="dxa" w:w="2268"/>
-          </w:tcPr>
-          <w:p>
-            <w:r/>
-            <w:r>
-              <w:rPr>
-                <w:sz w:val="20"/>
-              </w:rPr>
-              <w:t>C3  the peak</w:t>
-            </w:r>
-          </w:p>
-        </w:tc>
-        <w:tc>
-          <w:tcPr>
-            <w:tcW w:type="dxa" w:w="7143"/>
-          </w:tcPr>
-          <w:p>
-            <w:r/>
-            <w:r>
-              <w:rPr>
-                <w:sz w:val="20"/>
-              </w:rPr>
-              <w:t>q* = √(H/(3·k_t)) = 57.0 m²/s; u_jet = √(2g·2H/3) = 16.9 m/s; opening q*/u_jet = 3.37 m, 1.4 times the penstock bore and 2.8 times the top of the Nozzle gap slider. The peak is unreachable on this scheme. At the slider's top (1.2 m, about 18 m²/s) h_f = 0.73 m, 3.3% of the head, so the jet stays within 1.7% of √(2gH) = 20.7 m/s all the way up the slider and the power keeps rising with the gap.</w:t>
+              <w:t>23.7</w:t>
             </w:r>
           </w:p>
         </w:tc>
@@ -3059,7 +3404,7 @@
           <w:b w:val="0"/>
           <w:i/>
         </w:rPr>
-        <w:t>What the app measured (dry run, Medium resolution), crests above the reservoir for d = 0…9: 5.16, 4.79, 4.67, 4.18, 3.99, 3.79, 3.70, 3.58, 3.27, 3.22 m; periods: 14.9, 16.2, 17.6, 19.1, 18.9, 19.8, 21.2, 21.0, 22.2, 23.7 s. The crests are 0.90–0.97 of the frictionless value and the periods 15–28% over 2π·√(L·D_s/(g·D_h)), because the shaft's own water has inertia the formula leaves out.</w:t>
+        <w:t>The measured crests are 0.91–0.98 of the frictionless value and within about 5% of the with-friction column. The measured periods run 17–26% over the formula: the shaft's own water has inertia the rigid column leaves out (add h_s·A/A_s to L, with h_s ≈ 9 m of water standing in the shaft, and half the gap closes).</w:t>
       </w:r>
     </w:p>
     <w:sectPr>

</xml_diff>